<commit_message>
added notes for class 5-9
</commit_message>
<xml_diff>
--- a/class4-books/Final/Ankur/Final concise/Final Hindi.docx
+++ b/class4-books/Final/Ankur/Final concise/Final Hindi.docx
@@ -1671,7 +1671,7 @@
     <w:p>
       <w:r>
         <w:pict w14:anchorId="1C1F99A6">
-          <v:rect id="_x0000_i1049" style="width:0;height:.75pt" o:hralign="center" o:hrstd="t" o:hr="t" fillcolor="#a0a0a0" stroked="f"/>
+          <v:rect id="_x0000_i1025" style="width:0;height:.75pt" o:hralign="center" o:hrstd="t" o:hr="t" fillcolor="#a0a0a0" stroked="f"/>
         </w:pict>
       </w:r>
     </w:p>
@@ -3572,7 +3572,7 @@
     <w:p>
       <w:r>
         <w:pict w14:anchorId="035624E3">
-          <v:rect id="_x0000_i1050" style="width:0;height:.75pt" o:hralign="center" o:hrstd="t" o:hr="t" fillcolor="#a0a0a0" stroked="f"/>
+          <v:rect id="_x0000_i1026" style="width:0;height:.75pt" o:hralign="center" o:hrstd="t" o:hr="t" fillcolor="#a0a0a0" stroked="f"/>
         </w:pict>
       </w:r>
     </w:p>
@@ -4825,7 +4825,7 @@
     <w:p>
       <w:r>
         <w:pict w14:anchorId="1AD1D90E">
-          <v:rect id="_x0000_i1051" style="width:0;height:.75pt" o:hralign="center" o:hrstd="t" o:hr="t" fillcolor="#a0a0a0" stroked="f"/>
+          <v:rect id="_x0000_i1027" style="width:0;height:.75pt" o:hralign="center" o:hrstd="t" o:hr="t" fillcolor="#a0a0a0" stroked="f"/>
         </w:pict>
       </w:r>
     </w:p>
@@ -6859,7 +6859,7 @@
     <w:p>
       <w:r>
         <w:pict w14:anchorId="7F80B796">
-          <v:rect id="_x0000_i1052" style="width:0;height:.75pt" o:hralign="center" o:hrstd="t" o:hr="t" fillcolor="#a0a0a0" stroked="f"/>
+          <v:rect id="_x0000_i1028" style="width:0;height:.75pt" o:hralign="center" o:hrstd="t" o:hr="t" fillcolor="#a0a0a0" stroked="f"/>
         </w:pict>
       </w:r>
     </w:p>
@@ -9851,7 +9851,7 @@
     <w:p>
       <w:r>
         <w:pict w14:anchorId="7C4EC387">
-          <v:rect id="_x0000_i1063" style="width:0;height:.75pt" o:hralign="center" o:hrstd="t" o:hr="t" fillcolor="#a0a0a0" stroked="f"/>
+          <v:rect id="_x0000_i1029" style="width:0;height:.75pt" o:hralign="center" o:hrstd="t" o:hr="t" fillcolor="#a0a0a0" stroked="f"/>
         </w:pict>
       </w:r>
     </w:p>
@@ -13889,209 +13889,13 @@
     <w:p>
       <w:r>
         <w:pict w14:anchorId="68778E27">
-          <v:rect id="_x0000_i1173" style="width:0;height:.75pt" o:hralign="center" o:hrstd="t" o:hr="t" fillcolor="#a0a0a0" stroked="f"/>
+          <v:rect id="_x0000_i1030" style="width:0;height:.75pt" o:hralign="center" o:hrstd="t" o:hr="t" fillcolor="#a0a0a0" stroked="f"/>
         </w:pict>
       </w:r>
     </w:p>
     <w:p>
       <w:pPr>
-        <w:rPr>
-          <w:b/>
-          <w:bCs/>
-        </w:rPr>
-      </w:pPr>
-      <w:r>
-        <w:rPr>
-          <w:rFonts w:ascii="Segoe UI Emoji" w:hAnsi="Segoe UI Emoji" w:cs="Segoe UI Emoji"/>
-          <w:b/>
-          <w:bCs/>
-        </w:rPr>
-        <w:t>🪄</w:t>
-      </w:r>
-      <w:r>
-        <w:rPr>
-          <w:b/>
-          <w:bCs/>
-        </w:rPr>
-        <w:t xml:space="preserve"> </w:t>
-      </w:r>
-      <w:r>
-        <w:rPr>
-          <w:b/>
-          <w:bCs/>
-          <w:cs/>
-          <w:lang w:bidi="hi-IN"/>
-        </w:rPr>
-        <w:t>पत्र लेखन के लिए उपयोगी वाक्य (</w:t>
-      </w:r>
-      <w:r>
-        <w:rPr>
-          <w:b/>
-          <w:bCs/>
-        </w:rPr>
-        <w:t>Reusable Sentences)</w:t>
-      </w:r>
-    </w:p>
-    <w:p>
-      <w:r>
-        <w:rPr>
-          <w:b/>
-          <w:bCs/>
-          <w:cs/>
-          <w:lang w:bidi="hi-IN"/>
-        </w:rPr>
-        <w:t>अभिवादन के लिए:</w:t>
-      </w:r>
-    </w:p>
-    <w:p>
-      <w:pPr>
-        <w:numPr>
-          <w:ilvl w:val="0"/>
-          <w:numId w:val="48"/>
-        </w:numPr>
-      </w:pPr>
-      <w:r>
-        <w:rPr>
-          <w:cs/>
-          <w:lang w:bidi="hi-IN"/>
-        </w:rPr>
-        <w:t>सप्रेम नमस्ते।</w:t>
-      </w:r>
-    </w:p>
-    <w:p>
-      <w:pPr>
-        <w:numPr>
-          <w:ilvl w:val="0"/>
-          <w:numId w:val="48"/>
-        </w:numPr>
-      </w:pPr>
-      <w:r>
-        <w:rPr>
-          <w:cs/>
-          <w:lang w:bidi="hi-IN"/>
-        </w:rPr>
-        <w:t>पूज्य चरण स्पर्श।</w:t>
-      </w:r>
-    </w:p>
-    <w:p>
-      <w:pPr>
-        <w:numPr>
-          <w:ilvl w:val="0"/>
-          <w:numId w:val="48"/>
-        </w:numPr>
-      </w:pPr>
-      <w:r>
-        <w:rPr>
-          <w:cs/>
-          <w:lang w:bidi="hi-IN"/>
-        </w:rPr>
-        <w:t>आपका पत्र मिला और बहुत खुशी हुई।</w:t>
-      </w:r>
-    </w:p>
-    <w:p>
-      <w:pPr>
-        <w:numPr>
-          <w:ilvl w:val="0"/>
-          <w:numId w:val="48"/>
-        </w:numPr>
-      </w:pPr>
-      <w:r>
-        <w:rPr>
-          <w:cs/>
-          <w:lang w:bidi="hi-IN"/>
-        </w:rPr>
-        <w:t>आशा है आप सब कुशल मंगल होंगे।</w:t>
-      </w:r>
-    </w:p>
-    <w:p>
-      <w:r>
-        <w:rPr>
-          <w:b/>
-          <w:bCs/>
-          <w:cs/>
-          <w:lang w:bidi="hi-IN"/>
-        </w:rPr>
-        <w:t>मुख्य विषय के लिए:</w:t>
-      </w:r>
-    </w:p>
-    <w:p>
-      <w:pPr>
-        <w:numPr>
-          <w:ilvl w:val="0"/>
-          <w:numId w:val="49"/>
-        </w:numPr>
-      </w:pPr>
-      <w:r>
-        <w:rPr>
-          <w:cs/>
-          <w:lang w:bidi="hi-IN"/>
-        </w:rPr>
-        <w:t xml:space="preserve">मैं आपको यह पत्र </w:t>
-      </w:r>
-      <w:r>
-        <w:t xml:space="preserve">______ </w:t>
-      </w:r>
-      <w:r>
-        <w:rPr>
-          <w:cs/>
-          <w:lang w:bidi="hi-IN"/>
-        </w:rPr>
-        <w:t>के बारे में बताने के लिए लिख रहा हूँ।</w:t>
-      </w:r>
-    </w:p>
-    <w:p>
-      <w:pPr>
-        <w:numPr>
-          <w:ilvl w:val="0"/>
-          <w:numId w:val="49"/>
-        </w:numPr>
-      </w:pPr>
-      <w:r>
-        <w:rPr>
-          <w:cs/>
-          <w:lang w:bidi="hi-IN"/>
-        </w:rPr>
-        <w:t xml:space="preserve">कल हमारे विद्यालय में </w:t>
-      </w:r>
-      <w:r>
-        <w:t xml:space="preserve">______ </w:t>
-      </w:r>
-      <w:r>
-        <w:rPr>
-          <w:cs/>
-          <w:lang w:bidi="hi-IN"/>
-        </w:rPr>
-        <w:t>का आयोजन किया गया।</w:t>
-      </w:r>
-    </w:p>
-    <w:p>
-      <w:pPr>
-        <w:numPr>
-          <w:ilvl w:val="0"/>
-          <w:numId w:val="49"/>
-        </w:numPr>
-      </w:pPr>
-      <w:r>
-        <w:rPr>
-          <w:cs/>
-          <w:lang w:bidi="hi-IN"/>
-        </w:rPr>
-        <w:t>मैं आपसे एक विशेष प्रार्थना करना चाहता हूँ।</w:t>
-      </w:r>
-    </w:p>
-    <w:p>
-      <w:r>
-        <w:rPr>
-          <w:b/>
-          <w:bCs/>
-          <w:cs/>
-          <w:lang w:bidi="hi-IN"/>
-        </w:rPr>
-        <w:t>समापन के लिए:</w:t>
-      </w:r>
-    </w:p>
-    <w:p>
-      <w:pPr>
+        <w:pStyle w:val="NormalWeb"/>
         <w:numPr>
           <w:ilvl w:val="0"/>
           <w:numId w:val="50"/>
@@ -14099,15 +13903,24 @@
       </w:pPr>
       <w:r>
         <w:rPr>
-          <w:cs/>
-          <w:lang w:bidi="hi-IN"/>
-        </w:rPr>
-        <w:lastRenderedPageBreak/>
-        <w:t>शीघ्र उत्तर की प्रतीक्षा रहेगी।</w:t>
-      </w:r>
-    </w:p>
-    <w:p>
-      <w:pPr>
+          <w:rFonts w:hAnsi="Symbol"/>
+        </w:rPr>
+        <w:t></w:t>
+      </w:r>
+      <w:r>
+        <w:t xml:space="preserve">  </w:t>
+      </w:r>
+      <w:r>
+        <w:rPr>
+          <w:rFonts w:cs="Mangal"/>
+          <w:cs/>
+        </w:rPr>
+        <w:t>नमस्ते।</w:t>
+      </w:r>
+    </w:p>
+    <w:p>
+      <w:pPr>
+        <w:pStyle w:val="NormalWeb"/>
         <w:numPr>
           <w:ilvl w:val="0"/>
           <w:numId w:val="50"/>
@@ -14115,14 +13928,24 @@
       </w:pPr>
       <w:r>
         <w:rPr>
-          <w:cs/>
-          <w:lang w:bidi="hi-IN"/>
-        </w:rPr>
-        <w:t>माता-जी को मेरा प्रणाम और छोटों को प्यार।</w:t>
-      </w:r>
-    </w:p>
-    <w:p>
-      <w:pPr>
+          <w:rFonts w:hAnsi="Symbol"/>
+        </w:rPr>
+        <w:t></w:t>
+      </w:r>
+      <w:r>
+        <w:t xml:space="preserve">  </w:t>
+      </w:r>
+      <w:r>
+        <w:rPr>
+          <w:rFonts w:cs="Mangal"/>
+          <w:cs/>
+        </w:rPr>
+        <w:t>आशा है कि आप/तुम ठीक हो।</w:t>
+      </w:r>
+    </w:p>
+    <w:p>
+      <w:pPr>
+        <w:pStyle w:val="NormalWeb"/>
         <w:numPr>
           <w:ilvl w:val="0"/>
           <w:numId w:val="50"/>
@@ -14130,16 +13953,914 @@
       </w:pPr>
       <w:r>
         <w:rPr>
-          <w:cs/>
-          <w:lang w:bidi="hi-IN"/>
-        </w:rPr>
-        <w:t>अपना ख्याल रखना।</w:t>
-      </w:r>
+          <w:rFonts w:hAnsi="Symbol"/>
+        </w:rPr>
+        <w:t></w:t>
+      </w:r>
+      <w:r>
+        <w:t xml:space="preserve">  </w:t>
+      </w:r>
+      <w:r>
+        <w:rPr>
+          <w:rFonts w:cs="Mangal"/>
+          <w:cs/>
+        </w:rPr>
+        <w:t>मैं यहाँ ठीक हूँ।</w:t>
+      </w:r>
+    </w:p>
+    <w:p>
+      <w:pPr>
+        <w:pStyle w:val="NormalWeb"/>
+        <w:numPr>
+          <w:ilvl w:val="0"/>
+          <w:numId w:val="50"/>
+        </w:numPr>
+      </w:pPr>
+      <w:r>
+        <w:rPr>
+          <w:rFonts w:hAnsi="Symbol"/>
+        </w:rPr>
+        <w:t></w:t>
+      </w:r>
+      <w:r>
+        <w:t xml:space="preserve">  </w:t>
+      </w:r>
+      <w:r>
+        <w:rPr>
+          <w:rFonts w:cs="Mangal"/>
+          <w:cs/>
+        </w:rPr>
+        <w:t xml:space="preserve">मैं आपको/तुम्हें </w:t>
+      </w:r>
+      <w:r>
+        <w:t xml:space="preserve">______ </w:t>
+      </w:r>
+      <w:r>
+        <w:rPr>
+          <w:rFonts w:cs="Mangal"/>
+          <w:cs/>
+        </w:rPr>
+        <w:t>के बारे में बताना चाहता हूँ।</w:t>
+      </w:r>
+    </w:p>
+    <w:p>
+      <w:pPr>
+        <w:pStyle w:val="NormalWeb"/>
+        <w:numPr>
+          <w:ilvl w:val="0"/>
+          <w:numId w:val="50"/>
+        </w:numPr>
+      </w:pPr>
+      <w:r>
+        <w:rPr>
+          <w:rFonts w:hAnsi="Symbol"/>
+        </w:rPr>
+        <w:t></w:t>
+      </w:r>
+      <w:r>
+        <w:t xml:space="preserve">  </w:t>
+      </w:r>
+      <w:r>
+        <w:rPr>
+          <w:rFonts w:cs="Mangal"/>
+          <w:cs/>
+        </w:rPr>
+        <w:t xml:space="preserve">मुझे </w:t>
+      </w:r>
+      <w:r>
+        <w:t xml:space="preserve">______ </w:t>
+      </w:r>
+      <w:r>
+        <w:rPr>
+          <w:rFonts w:cs="Mangal"/>
+          <w:cs/>
+        </w:rPr>
+        <w:t>बहुत पसंद है।</w:t>
+      </w:r>
+    </w:p>
+    <w:p>
+      <w:pPr>
+        <w:pStyle w:val="NormalWeb"/>
+        <w:numPr>
+          <w:ilvl w:val="0"/>
+          <w:numId w:val="50"/>
+        </w:numPr>
+      </w:pPr>
+      <w:r>
+        <w:rPr>
+          <w:rFonts w:hAnsi="Symbol"/>
+        </w:rPr>
+        <w:t></w:t>
+      </w:r>
+      <w:r>
+        <w:t xml:space="preserve">  </w:t>
+      </w:r>
+      <w:r>
+        <w:rPr>
+          <w:rFonts w:cs="Mangal"/>
+          <w:cs/>
+        </w:rPr>
+        <w:t>जल्दी मिलते हैं।</w:t>
+      </w:r>
+    </w:p>
+    <w:p>
+      <w:pPr>
+        <w:ind w:left="720"/>
+        <w:rPr>
+          <w:b/>
+          <w:bCs/>
+        </w:rPr>
+      </w:pPr>
+      <w:r>
+        <w:rPr>
+          <w:rFonts w:ascii="Segoe UI Emoji" w:hAnsi="Segoe UI Emoji" w:cs="Segoe UI Emoji"/>
+          <w:b/>
+          <w:bCs/>
+        </w:rPr>
+        <w:t>🟢</w:t>
+      </w:r>
+      <w:r>
+        <w:rPr>
+          <w:b/>
+          <w:bCs/>
+        </w:rPr>
+        <w:t xml:space="preserve"> 1️</w:t>
+      </w:r>
+      <w:r>
+        <w:rPr>
+          <w:rFonts w:ascii="Segoe UI Symbol" w:hAnsi="Segoe UI Symbol" w:cs="Segoe UI Symbol"/>
+          <w:b/>
+          <w:bCs/>
+        </w:rPr>
+        <w:t>⃣</w:t>
+      </w:r>
+      <w:r>
+        <w:rPr>
+          <w:b/>
+          <w:bCs/>
+        </w:rPr>
+        <w:t xml:space="preserve"> Greeting / Opening Lines (Very Reusable)</w:t>
+      </w:r>
+    </w:p>
+    <w:p>
+      <w:pPr>
+        <w:numPr>
+          <w:ilvl w:val="0"/>
+          <w:numId w:val="63"/>
+        </w:numPr>
+      </w:pPr>
+      <w:r>
+        <w:rPr>
+          <w:cs/>
+          <w:lang w:bidi="hi-IN"/>
+        </w:rPr>
+        <w:t>नमस्ते।</w:t>
+      </w:r>
+    </w:p>
+    <w:p>
+      <w:pPr>
+        <w:numPr>
+          <w:ilvl w:val="0"/>
+          <w:numId w:val="63"/>
+        </w:numPr>
+      </w:pPr>
+      <w:r>
+        <w:rPr>
+          <w:cs/>
+          <w:lang w:bidi="hi-IN"/>
+        </w:rPr>
+        <w:t>तुम कैसे हो</w:t>
+      </w:r>
+      <w:r>
+        <w:t>?</w:t>
+      </w:r>
+    </w:p>
+    <w:p>
+      <w:pPr>
+        <w:numPr>
+          <w:ilvl w:val="0"/>
+          <w:numId w:val="63"/>
+        </w:numPr>
+      </w:pPr>
+      <w:r>
+        <w:rPr>
+          <w:cs/>
+          <w:lang w:bidi="hi-IN"/>
+        </w:rPr>
+        <w:t>आप कैसी हैं</w:t>
+      </w:r>
+      <w:r>
+        <w:t>?</w:t>
+      </w:r>
+    </w:p>
+    <w:p>
+      <w:pPr>
+        <w:numPr>
+          <w:ilvl w:val="0"/>
+          <w:numId w:val="63"/>
+        </w:numPr>
+      </w:pPr>
+      <w:r>
+        <w:rPr>
+          <w:cs/>
+          <w:lang w:bidi="hi-IN"/>
+        </w:rPr>
+        <w:t>आशा है कि तुम ठीक हो।</w:t>
+      </w:r>
+    </w:p>
+    <w:p>
+      <w:pPr>
+        <w:numPr>
+          <w:ilvl w:val="0"/>
+          <w:numId w:val="63"/>
+        </w:numPr>
+      </w:pPr>
+      <w:r>
+        <w:rPr>
+          <w:cs/>
+          <w:lang w:bidi="hi-IN"/>
+        </w:rPr>
+        <w:t>आशा है कि आप ठीक हैं।</w:t>
+      </w:r>
+    </w:p>
+    <w:p>
+      <w:pPr>
+        <w:numPr>
+          <w:ilvl w:val="0"/>
+          <w:numId w:val="63"/>
+        </w:numPr>
+      </w:pPr>
+      <w:r>
+        <w:rPr>
+          <w:cs/>
+          <w:lang w:bidi="hi-IN"/>
+        </w:rPr>
+        <w:lastRenderedPageBreak/>
+        <w:t>मैं यहाँ ठीक हूँ।</w:t>
+      </w:r>
+    </w:p>
+    <w:p>
+      <w:pPr>
+        <w:ind w:left="720"/>
+      </w:pPr>
+      <w:r>
+        <w:rPr>
+          <w:rFonts w:ascii="Segoe UI Emoji" w:hAnsi="Segoe UI Emoji" w:cs="Segoe UI Emoji"/>
+        </w:rPr>
+        <w:t>👉</w:t>
+      </w:r>
+      <w:r>
+        <w:t xml:space="preserve"> These can be used in </w:t>
+      </w:r>
+      <w:r>
+        <w:rPr>
+          <w:b/>
+          <w:bCs/>
+        </w:rPr>
+        <w:t>any letter</w:t>
+      </w:r>
+      <w:r>
+        <w:t xml:space="preserve"> (friend, parents, grandparents).</w:t>
+      </w:r>
+    </w:p>
+    <w:p>
+      <w:pPr>
+        <w:ind w:left="720"/>
+      </w:pPr>
+      <w:r>
+        <w:pict w14:anchorId="6DBDD41D">
+          <v:rect id="_x0000_i1127" style="width:0;height:1.5pt" o:hralign="center" o:hrstd="t" o:hr="t" fillcolor="#a0a0a0" stroked="f"/>
+        </w:pict>
+      </w:r>
+    </w:p>
+    <w:p>
+      <w:pPr>
+        <w:ind w:left="720"/>
+        <w:rPr>
+          <w:b/>
+          <w:bCs/>
+        </w:rPr>
+      </w:pPr>
+      <w:r>
+        <w:rPr>
+          <w:rFonts w:ascii="Segoe UI Emoji" w:hAnsi="Segoe UI Emoji" w:cs="Segoe UI Emoji"/>
+          <w:b/>
+          <w:bCs/>
+        </w:rPr>
+        <w:t>🟢</w:t>
+      </w:r>
+      <w:r>
+        <w:rPr>
+          <w:b/>
+          <w:bCs/>
+        </w:rPr>
+        <w:t xml:space="preserve"> 2️</w:t>
+      </w:r>
+      <w:r>
+        <w:rPr>
+          <w:rFonts w:ascii="Segoe UI Symbol" w:hAnsi="Segoe UI Symbol" w:cs="Segoe UI Symbol"/>
+          <w:b/>
+          <w:bCs/>
+        </w:rPr>
+        <w:t>⃣</w:t>
+      </w:r>
+      <w:r>
+        <w:rPr>
+          <w:b/>
+          <w:bCs/>
+        </w:rPr>
+        <w:t xml:space="preserve"> Introducing the Topic (SUPER IMPORTANT MASTER LINE)</w:t>
+      </w:r>
+    </w:p>
+    <w:p>
+      <w:pPr>
+        <w:numPr>
+          <w:ilvl w:val="0"/>
+          <w:numId w:val="64"/>
+        </w:numPr>
+      </w:pPr>
+      <w:r>
+        <w:rPr>
+          <w:cs/>
+          <w:lang w:bidi="hi-IN"/>
+        </w:rPr>
+        <w:t>मैं तुम्हें अपने बारे में कुछ बताना चाहता हूँ।</w:t>
+      </w:r>
+    </w:p>
+    <w:p>
+      <w:pPr>
+        <w:numPr>
+          <w:ilvl w:val="0"/>
+          <w:numId w:val="64"/>
+        </w:numPr>
+      </w:pPr>
+      <w:r>
+        <w:rPr>
+          <w:cs/>
+          <w:lang w:bidi="hi-IN"/>
+        </w:rPr>
+        <w:t>मैं आपको अपने बारे में कुछ बताना चाहता हूँ।</w:t>
+      </w:r>
+    </w:p>
+    <w:p>
+      <w:pPr>
+        <w:numPr>
+          <w:ilvl w:val="0"/>
+          <w:numId w:val="64"/>
+        </w:numPr>
+      </w:pPr>
+      <w:r>
+        <w:rPr>
+          <w:cs/>
+          <w:lang w:bidi="hi-IN"/>
+        </w:rPr>
+        <w:t xml:space="preserve">मैं आपको </w:t>
+      </w:r>
+      <w:r>
+        <w:t xml:space="preserve">______ </w:t>
+      </w:r>
+      <w:r>
+        <w:rPr>
+          <w:cs/>
+          <w:lang w:bidi="hi-IN"/>
+        </w:rPr>
+        <w:t>के बारे में बताना चाहता हूँ।</w:t>
+      </w:r>
+    </w:p>
+    <w:p>
+      <w:pPr>
+        <w:ind w:left="720"/>
+      </w:pPr>
+      <w:r>
+        <w:rPr>
+          <w:rFonts w:ascii="Segoe UI Emoji" w:hAnsi="Segoe UI Emoji" w:cs="Segoe UI Emoji"/>
+        </w:rPr>
+        <w:t>👉</w:t>
+      </w:r>
+      <w:r>
+        <w:t xml:space="preserve"> Just change the middle word (</w:t>
+      </w:r>
+      <w:r>
+        <w:rPr>
+          <w:cs/>
+          <w:lang w:bidi="hi-IN"/>
+        </w:rPr>
+        <w:t>शौक</w:t>
+      </w:r>
+      <w:r>
+        <w:t xml:space="preserve">, </w:t>
+      </w:r>
+      <w:r>
+        <w:rPr>
+          <w:cs/>
+          <w:lang w:bidi="hi-IN"/>
+        </w:rPr>
+        <w:t>किताब</w:t>
+      </w:r>
+      <w:r>
+        <w:t xml:space="preserve">, </w:t>
+      </w:r>
+      <w:r>
+        <w:rPr>
+          <w:cs/>
+          <w:lang w:bidi="hi-IN"/>
+        </w:rPr>
+        <w:t>यात्रा</w:t>
+      </w:r>
+      <w:r>
+        <w:t xml:space="preserve">, </w:t>
+      </w:r>
+      <w:r>
+        <w:rPr>
+          <w:cs/>
+          <w:lang w:bidi="hi-IN"/>
+        </w:rPr>
+        <w:t>स्कूल</w:t>
+      </w:r>
+      <w:r>
+        <w:t xml:space="preserve">, </w:t>
+      </w:r>
+      <w:r>
+        <w:rPr>
+          <w:cs/>
+          <w:lang w:bidi="hi-IN"/>
+        </w:rPr>
+        <w:t>आदि).</w:t>
+      </w:r>
+    </w:p>
+    <w:p>
+      <w:pPr>
+        <w:ind w:left="720"/>
+      </w:pPr>
+      <w:r>
+        <w:pict w14:anchorId="267F4882">
+          <v:rect id="_x0000_i1128" style="width:0;height:1.5pt" o:hralign="center" o:hrstd="t" o:hr="t" fillcolor="#a0a0a0" stroked="f"/>
+        </w:pict>
+      </w:r>
+    </w:p>
+    <w:p>
+      <w:pPr>
+        <w:ind w:left="720"/>
+        <w:rPr>
+          <w:b/>
+          <w:bCs/>
+        </w:rPr>
+      </w:pPr>
+      <w:r>
+        <w:rPr>
+          <w:rFonts w:ascii="Segoe UI Emoji" w:hAnsi="Segoe UI Emoji" w:cs="Segoe UI Emoji"/>
+          <w:b/>
+          <w:bCs/>
+        </w:rPr>
+        <w:t>🟢</w:t>
+      </w:r>
+      <w:r>
+        <w:rPr>
+          <w:b/>
+          <w:bCs/>
+        </w:rPr>
+        <w:t xml:space="preserve"> 3️</w:t>
+      </w:r>
+      <w:r>
+        <w:rPr>
+          <w:rFonts w:ascii="Segoe UI Symbol" w:hAnsi="Segoe UI Symbol" w:cs="Segoe UI Symbol"/>
+          <w:b/>
+          <w:bCs/>
+        </w:rPr>
+        <w:t>⃣</w:t>
+      </w:r>
+      <w:r>
+        <w:rPr>
+          <w:b/>
+          <w:bCs/>
+        </w:rPr>
+        <w:t xml:space="preserve"> Expressing Liking / Feelings</w:t>
+      </w:r>
+    </w:p>
+    <w:p>
+      <w:pPr>
+        <w:numPr>
+          <w:ilvl w:val="0"/>
+          <w:numId w:val="65"/>
+        </w:numPr>
+      </w:pPr>
+      <w:r>
+        <w:rPr>
+          <w:cs/>
+          <w:lang w:bidi="hi-IN"/>
+        </w:rPr>
+        <w:t xml:space="preserve">मुझे </w:t>
+      </w:r>
+      <w:r>
+        <w:t xml:space="preserve">______ </w:t>
+      </w:r>
+      <w:r>
+        <w:rPr>
+          <w:cs/>
+          <w:lang w:bidi="hi-IN"/>
+        </w:rPr>
+        <w:t>बहुत पसंद है।</w:t>
+      </w:r>
+    </w:p>
+    <w:p>
+      <w:pPr>
+        <w:numPr>
+          <w:ilvl w:val="0"/>
+          <w:numId w:val="65"/>
+        </w:numPr>
+      </w:pPr>
+      <w:r>
+        <w:rPr>
+          <w:cs/>
+          <w:lang w:bidi="hi-IN"/>
+        </w:rPr>
+        <w:t xml:space="preserve">मुझे </w:t>
+      </w:r>
+      <w:r>
+        <w:t xml:space="preserve">______ </w:t>
+      </w:r>
+      <w:r>
+        <w:rPr>
+          <w:cs/>
+          <w:lang w:bidi="hi-IN"/>
+        </w:rPr>
+        <w:t>अच्छा लगता है।</w:t>
+      </w:r>
+    </w:p>
+    <w:p>
+      <w:pPr>
+        <w:numPr>
+          <w:ilvl w:val="0"/>
+          <w:numId w:val="65"/>
+        </w:numPr>
+      </w:pPr>
+      <w:r>
+        <w:rPr>
+          <w:cs/>
+          <w:lang w:bidi="hi-IN"/>
+        </w:rPr>
+        <w:t>मैं यहाँ बहुत खुश हूँ।</w:t>
+      </w:r>
+    </w:p>
+    <w:p>
+      <w:pPr>
+        <w:numPr>
+          <w:ilvl w:val="0"/>
+          <w:numId w:val="65"/>
+        </w:numPr>
+      </w:pPr>
+      <w:r>
+        <w:rPr>
+          <w:cs/>
+          <w:lang w:bidi="hi-IN"/>
+        </w:rPr>
+        <w:t>मुझे यहाँ बहुत अच्छा लग रहा है।</w:t>
+      </w:r>
+    </w:p>
+    <w:p>
+      <w:pPr>
+        <w:ind w:left="720"/>
+      </w:pPr>
+      <w:r>
+        <w:rPr>
+          <w:rFonts w:ascii="Segoe UI Emoji" w:hAnsi="Segoe UI Emoji" w:cs="Segoe UI Emoji"/>
+        </w:rPr>
+        <w:t>👉</w:t>
+      </w:r>
+      <w:r>
+        <w:t xml:space="preserve"> Fill the blank with any topic.</w:t>
+      </w:r>
+    </w:p>
+    <w:p>
+      <w:pPr>
+        <w:ind w:left="720"/>
+      </w:pPr>
+      <w:r>
+        <w:pict w14:anchorId="7C0D7352">
+          <v:rect id="_x0000_i1129" style="width:0;height:1.5pt" o:hralign="center" o:hrstd="t" o:hr="t" fillcolor="#a0a0a0" stroked="f"/>
+        </w:pict>
+      </w:r>
+    </w:p>
+    <w:p>
+      <w:pPr>
+        <w:ind w:left="720"/>
+        <w:rPr>
+          <w:b/>
+          <w:bCs/>
+        </w:rPr>
+      </w:pPr>
+      <w:r>
+        <w:rPr>
+          <w:rFonts w:ascii="Segoe UI Emoji" w:hAnsi="Segoe UI Emoji" w:cs="Segoe UI Emoji"/>
+          <w:b/>
+          <w:bCs/>
+        </w:rPr>
+        <w:t>🟢</w:t>
+      </w:r>
+      <w:r>
+        <w:rPr>
+          <w:b/>
+          <w:bCs/>
+        </w:rPr>
+        <w:t xml:space="preserve"> 4️</w:t>
+      </w:r>
+      <w:r>
+        <w:rPr>
+          <w:rFonts w:ascii="Segoe UI Symbol" w:hAnsi="Segoe UI Symbol" w:cs="Segoe UI Symbol"/>
+          <w:b/>
+          <w:bCs/>
+        </w:rPr>
+        <w:t>⃣</w:t>
+      </w:r>
+      <w:r>
+        <w:rPr>
+          <w:b/>
+          <w:bCs/>
+        </w:rPr>
+        <w:t xml:space="preserve"> Concern / Care Sentences</w:t>
+      </w:r>
+    </w:p>
+    <w:p>
+      <w:pPr>
+        <w:numPr>
+          <w:ilvl w:val="0"/>
+          <w:numId w:val="66"/>
+        </w:numPr>
+      </w:pPr>
+      <w:r>
+        <w:rPr>
+          <w:cs/>
+          <w:lang w:bidi="hi-IN"/>
+        </w:rPr>
+        <w:t>मुझे पता चला कि तुम बीमार हो।</w:t>
+      </w:r>
+    </w:p>
+    <w:p>
+      <w:pPr>
+        <w:numPr>
+          <w:ilvl w:val="0"/>
+          <w:numId w:val="66"/>
+        </w:numPr>
+      </w:pPr>
+      <w:r>
+        <w:rPr>
+          <w:cs/>
+          <w:lang w:bidi="hi-IN"/>
+        </w:rPr>
+        <w:t>तुम आराम करो।</w:t>
+      </w:r>
+    </w:p>
+    <w:p>
+      <w:pPr>
+        <w:numPr>
+          <w:ilvl w:val="0"/>
+          <w:numId w:val="66"/>
+        </w:numPr>
+      </w:pPr>
+      <w:r>
+        <w:rPr>
+          <w:cs/>
+          <w:lang w:bidi="hi-IN"/>
+        </w:rPr>
+        <w:t>समय पर दवा लो।</w:t>
+      </w:r>
+    </w:p>
+    <w:p>
+      <w:pPr>
+        <w:numPr>
+          <w:ilvl w:val="0"/>
+          <w:numId w:val="66"/>
+        </w:numPr>
+      </w:pPr>
+      <w:r>
+        <w:rPr>
+          <w:cs/>
+          <w:lang w:bidi="hi-IN"/>
+        </w:rPr>
+        <w:t>मैं तुम्हारे लिए प्रार्थना करता हूँ।</w:t>
+      </w:r>
+    </w:p>
+    <w:p>
+      <w:pPr>
+        <w:ind w:left="720"/>
+      </w:pPr>
+      <w:r>
+        <w:rPr>
+          <w:rFonts w:ascii="Segoe UI Emoji" w:hAnsi="Segoe UI Emoji" w:cs="Segoe UI Emoji"/>
+        </w:rPr>
+        <w:t>👉</w:t>
+      </w:r>
+      <w:r>
+        <w:t xml:space="preserve"> Useful for sick friend letters.</w:t>
+      </w:r>
+    </w:p>
+    <w:p>
+      <w:pPr>
+        <w:ind w:left="720"/>
+      </w:pPr>
+      <w:r>
+        <w:lastRenderedPageBreak/>
+        <w:pict w14:anchorId="2B0E17A9">
+          <v:rect id="_x0000_i1130" style="width:0;height:1.5pt" o:hralign="center" o:hrstd="t" o:hr="t" fillcolor="#a0a0a0" stroked="f"/>
+        </w:pict>
+      </w:r>
+    </w:p>
+    <w:p>
+      <w:pPr>
+        <w:ind w:left="720"/>
+        <w:rPr>
+          <w:b/>
+          <w:bCs/>
+        </w:rPr>
+      </w:pPr>
+      <w:r>
+        <w:rPr>
+          <w:rFonts w:ascii="Segoe UI Emoji" w:hAnsi="Segoe UI Emoji" w:cs="Segoe UI Emoji"/>
+          <w:b/>
+          <w:bCs/>
+        </w:rPr>
+        <w:t>🟢</w:t>
+      </w:r>
+      <w:r>
+        <w:rPr>
+          <w:b/>
+          <w:bCs/>
+        </w:rPr>
+        <w:t xml:space="preserve"> 5️</w:t>
+      </w:r>
+      <w:r>
+        <w:rPr>
+          <w:rFonts w:ascii="Segoe UI Symbol" w:hAnsi="Segoe UI Symbol" w:cs="Segoe UI Symbol"/>
+          <w:b/>
+          <w:bCs/>
+        </w:rPr>
+        <w:t>⃣</w:t>
+      </w:r>
+      <w:r>
+        <w:rPr>
+          <w:b/>
+          <w:bCs/>
+        </w:rPr>
+        <w:t xml:space="preserve"> Closing Sentences (Very Important)</w:t>
+      </w:r>
+    </w:p>
+    <w:p>
+      <w:pPr>
+        <w:numPr>
+          <w:ilvl w:val="0"/>
+          <w:numId w:val="67"/>
+        </w:numPr>
+      </w:pPr>
+      <w:r>
+        <w:rPr>
+          <w:cs/>
+          <w:lang w:bidi="hi-IN"/>
+        </w:rPr>
+        <w:t>तुम अपने बारे में मुझे ज़रूर लिखना।</w:t>
+      </w:r>
+    </w:p>
+    <w:p>
+      <w:pPr>
+        <w:numPr>
+          <w:ilvl w:val="0"/>
+          <w:numId w:val="67"/>
+        </w:numPr>
+      </w:pPr>
+      <w:r>
+        <w:rPr>
+          <w:cs/>
+          <w:lang w:bidi="hi-IN"/>
+        </w:rPr>
+        <w:t>जल्दी मिलते हैं।</w:t>
+      </w:r>
+    </w:p>
+    <w:p>
+      <w:pPr>
+        <w:numPr>
+          <w:ilvl w:val="0"/>
+          <w:numId w:val="67"/>
+        </w:numPr>
+      </w:pPr>
+      <w:r>
+        <w:rPr>
+          <w:cs/>
+          <w:lang w:bidi="hi-IN"/>
+        </w:rPr>
+        <w:t>मैं आपको याद करता हूँ।</w:t>
+      </w:r>
+    </w:p>
+    <w:p>
+      <w:pPr>
+        <w:ind w:left="720"/>
+      </w:pPr>
+      <w:r>
+        <w:pict w14:anchorId="56AE866F">
+          <v:rect id="_x0000_i1131" style="width:0;height:1.5pt" o:hralign="center" o:hrstd="t" o:hr="t" fillcolor="#a0a0a0" stroked="f"/>
+        </w:pict>
+      </w:r>
+    </w:p>
+    <w:p>
+      <w:pPr>
+        <w:ind w:left="720"/>
+        <w:rPr>
+          <w:b/>
+          <w:bCs/>
+        </w:rPr>
+      </w:pPr>
+      <w:r>
+        <w:rPr>
+          <w:rFonts w:ascii="Segoe UI Emoji" w:hAnsi="Segoe UI Emoji" w:cs="Segoe UI Emoji"/>
+          <w:b/>
+          <w:bCs/>
+        </w:rPr>
+        <w:t>🟢</w:t>
+      </w:r>
+      <w:r>
+        <w:rPr>
+          <w:b/>
+          <w:bCs/>
+        </w:rPr>
+        <w:t xml:space="preserve"> 6️</w:t>
+      </w:r>
+      <w:r>
+        <w:rPr>
+          <w:rFonts w:ascii="Segoe UI Symbol" w:hAnsi="Segoe UI Symbol" w:cs="Segoe UI Symbol"/>
+          <w:b/>
+          <w:bCs/>
+        </w:rPr>
+        <w:t>⃣</w:t>
+      </w:r>
+      <w:r>
+        <w:rPr>
+          <w:b/>
+          <w:bCs/>
+        </w:rPr>
+        <w:t xml:space="preserve"> Signature Lines (Ending)</w:t>
+      </w:r>
+    </w:p>
+    <w:p>
+      <w:pPr>
+        <w:numPr>
+          <w:ilvl w:val="0"/>
+          <w:numId w:val="68"/>
+        </w:numPr>
+      </w:pPr>
+      <w:r>
+        <w:rPr>
+          <w:cs/>
+          <w:lang w:bidi="hi-IN"/>
+        </w:rPr>
+        <w:t>तुम्हारा मित्र</w:t>
+      </w:r>
+      <w:r>
+        <w:t>,</w:t>
+      </w:r>
+    </w:p>
+    <w:p>
+      <w:pPr>
+        <w:numPr>
+          <w:ilvl w:val="0"/>
+          <w:numId w:val="68"/>
+        </w:numPr>
+      </w:pPr>
+      <w:r>
+        <w:rPr>
+          <w:cs/>
+          <w:lang w:bidi="hi-IN"/>
+        </w:rPr>
+        <w:t>आपका प्यारा</w:t>
+      </w:r>
+      <w:r>
+        <w:t>,</w:t>
+      </w:r>
+    </w:p>
+    <w:p>
+      <w:pPr>
+        <w:numPr>
+          <w:ilvl w:val="0"/>
+          <w:numId w:val="68"/>
+        </w:numPr>
+      </w:pPr>
+      <w:r>
+        <w:rPr>
+          <w:cs/>
+          <w:lang w:bidi="hi-IN"/>
+        </w:rPr>
+        <w:t>आपका बेटा</w:t>
+      </w:r>
+      <w:r>
+        <w:t>,</w:t>
+      </w:r>
+    </w:p>
+    <w:p>
+      <w:pPr>
+        <w:ind w:left="720"/>
+      </w:pPr>
     </w:p>
     <w:p>
       <w:r>
         <w:pict w14:anchorId="4D9566CD">
-          <v:rect id="_x0000_i1174" style="width:0;height:.75pt" o:hralign="center" o:hrstd="t" o:hr="t" fillcolor="#a0a0a0" stroked="f"/>
+          <v:rect id="_x0000_i1031" style="width:0;height:.75pt" o:hralign="center" o:hrstd="t" o:hr="t" fillcolor="#a0a0a0" stroked="f"/>
         </w:pict>
       </w:r>
     </w:p>
@@ -14221,7 +14942,39 @@
           <w:cs/>
           <w:lang w:bidi="hi-IN"/>
         </w:rPr>
-        <w:t>प्रिय मित्र रोहित</w:t>
+        <w:t>पुणे</w:t>
+      </w:r>
+      <w:r>
+        <w:br/>
+      </w:r>
+      <w:r>
+        <w:rPr>
+          <w:cs/>
+          <w:lang w:bidi="hi-IN"/>
+        </w:rPr>
+        <w:t xml:space="preserve">दिनांक: </w:t>
+      </w:r>
+      <w:r>
+        <w:t xml:space="preserve">3 </w:t>
+      </w:r>
+      <w:r>
+        <w:rPr>
+          <w:cs/>
+          <w:lang w:bidi="hi-IN"/>
+        </w:rPr>
+        <w:t xml:space="preserve">मार्च </w:t>
+      </w:r>
+      <w:r>
+        <w:t>2026</w:t>
+      </w:r>
+    </w:p>
+    <w:p>
+      <w:r>
+        <w:rPr>
+          <w:cs/>
+          <w:lang w:bidi="hi-IN"/>
+        </w:rPr>
+        <w:t>प्रिय मित्र एकांश</w:t>
       </w:r>
       <w:r>
         <w:t>,</w:t>
@@ -14233,42 +14986,47 @@
           <w:cs/>
           <w:lang w:bidi="hi-IN"/>
         </w:rPr>
-        <w:t>सप्रेम नमस्ते। आशा है तुम स्वस्थ हो।</w:t>
-      </w:r>
-    </w:p>
-    <w:p>
-      <w:r>
-        <w:rPr>
-          <w:cs/>
-          <w:lang w:bidi="hi-IN"/>
-        </w:rPr>
-        <w:t>मैं तुम्हें यह पत्र तुम्हें जन्मदिन की हार्दिक शुभकामनाएँ देने के लिए लिख रहा हूँ। ईश्वर तुम्हें लंबी उम्र दे और सफल बनाए।</w:t>
-      </w:r>
-    </w:p>
-    <w:p>
-      <w:r>
-        <w:rPr>
-          <w:cs/>
-          <w:lang w:bidi="hi-IN"/>
-        </w:rPr>
-        <w:t>माता-जी को मेरा प्रणाम। शीघ्र मिलते हैं।</w:t>
-      </w:r>
-    </w:p>
-    <w:p>
-      <w:r>
-        <w:rPr>
-          <w:b/>
-          <w:bCs/>
-          <w:cs/>
-          <w:lang w:bidi="hi-IN"/>
-        </w:rPr>
+        <w:t>नमस्ते। तुम कैसे हो</w:t>
+      </w:r>
+      <w:r>
+        <w:t xml:space="preserve">? </w:t>
+      </w:r>
+      <w:r>
+        <w:rPr>
+          <w:cs/>
+          <w:lang w:bidi="hi-IN"/>
+        </w:rPr>
+        <w:t>आशा है कि तुम ठीक हो। मैं यहाँ ठीक हूँ।</w:t>
+      </w:r>
+    </w:p>
+    <w:p>
+      <w:r>
+        <w:rPr>
+          <w:cs/>
+          <w:lang w:bidi="hi-IN"/>
+        </w:rPr>
+        <w:t>मैं तुम्हें यह पत्र जन्मदिन की हार्दिक शुभकामनाएँ देने के लिए लिख रहा हूँ। ईश्वर तुम्हें लंबी उम्र दे और सफल बनाए।</w:t>
+      </w:r>
+    </w:p>
+    <w:p>
+      <w:r>
+        <w:rPr>
+          <w:cs/>
+          <w:lang w:bidi="hi-IN"/>
+        </w:rPr>
+        <w:t>जल्दी मिलते हैं।</w:t>
+      </w:r>
+    </w:p>
+    <w:p>
+      <w:r>
+        <w:rPr>
+          <w:cs/>
+          <w:lang w:bidi="hi-IN"/>
+        </w:rPr>
+        <w:lastRenderedPageBreak/>
         <w:t>तुम्हारा मित्र</w:t>
       </w:r>
       <w:r>
-        <w:rPr>
-          <w:b/>
-          <w:bCs/>
-        </w:rPr>
         <w:t>,</w:t>
       </w:r>
       <w:r>
@@ -14276,13 +15034,20 @@
       </w:r>
       <w:r>
         <w:rPr>
-          <w:b/>
-          <w:bCs/>
-          <w:cs/>
-          <w:lang w:bidi="hi-IN"/>
-        </w:rPr>
-        <w:t>आकाश</w:t>
-      </w:r>
+          <w:cs/>
+          <w:lang w:bidi="hi-IN"/>
+        </w:rPr>
+        <w:t>त्रेयांश</w:t>
+      </w:r>
+    </w:p>
+    <w:p>
+      <w:pPr>
+        <w:rPr>
+          <w:b/>
+          <w:bCs/>
+          <w:lang w:bidi="hi-IN"/>
+        </w:rPr>
+      </w:pPr>
     </w:p>
     <w:p>
       <w:pPr>
@@ -14386,10 +15151,152 @@
         <w:t>राहुल</w:t>
       </w:r>
     </w:p>
-    <w:p>
-      <w:r>
-        <w:pict w14:anchorId="7795B13E">
-          <v:rect id="_x0000_i1175" style="width:0;height:.75pt" o:hralign="center" o:hrstd="t" o:hr="t" fillcolor="#a0a0a0" stroked="f"/>
+    <w:p/>
+    <w:p>
+      <w:pPr>
+        <w:rPr>
+          <w:b/>
+          <w:bCs/>
+        </w:rPr>
+      </w:pPr>
+      <w:r>
+        <w:rPr>
+          <w:rFonts w:ascii="Segoe UI Symbol" w:hAnsi="Segoe UI Symbol" w:cs="Segoe UI Symbol"/>
+          <w:b/>
+          <w:bCs/>
+        </w:rPr>
+        <w:t>✉</w:t>
+      </w:r>
+      <w:r>
+        <w:rPr>
+          <w:b/>
+          <w:bCs/>
+        </w:rPr>
+        <w:t>️ 1️</w:t>
+      </w:r>
+      <w:r>
+        <w:rPr>
+          <w:rFonts w:ascii="Segoe UI Symbol" w:hAnsi="Segoe UI Symbol" w:cs="Segoe UI Symbol"/>
+          <w:b/>
+          <w:bCs/>
+        </w:rPr>
+        <w:t>⃣</w:t>
+      </w:r>
+      <w:r>
+        <w:rPr>
+          <w:b/>
+          <w:bCs/>
+        </w:rPr>
+        <w:t xml:space="preserve"> Friend Ekansh (About Hobbies)</w:t>
+      </w:r>
+    </w:p>
+    <w:p>
+      <w:r>
+        <w:rPr>
+          <w:cs/>
+          <w:lang w:bidi="hi-IN"/>
+        </w:rPr>
+        <w:t>पुणे</w:t>
+      </w:r>
+      <w:r>
+        <w:br/>
+      </w:r>
+      <w:r>
+        <w:rPr>
+          <w:cs/>
+          <w:lang w:bidi="hi-IN"/>
+        </w:rPr>
+        <w:t xml:space="preserve">दिनांक: </w:t>
+      </w:r>
+      <w:r>
+        <w:t xml:space="preserve">3 </w:t>
+      </w:r>
+      <w:r>
+        <w:rPr>
+          <w:cs/>
+          <w:lang w:bidi="hi-IN"/>
+        </w:rPr>
+        <w:t xml:space="preserve">मार्च </w:t>
+      </w:r>
+      <w:r>
+        <w:t>2026</w:t>
+      </w:r>
+    </w:p>
+    <w:p>
+      <w:r>
+        <w:rPr>
+          <w:cs/>
+          <w:lang w:bidi="hi-IN"/>
+        </w:rPr>
+        <w:t>प्रिय मित्र एकांश</w:t>
+      </w:r>
+      <w:r>
+        <w:t>,</w:t>
+      </w:r>
+    </w:p>
+    <w:p>
+      <w:r>
+        <w:rPr>
+          <w:cs/>
+          <w:lang w:bidi="hi-IN"/>
+        </w:rPr>
+        <w:t>नमस्ते। तुम कैसे हो</w:t>
+      </w:r>
+      <w:r>
+        <w:t xml:space="preserve">? </w:t>
+      </w:r>
+      <w:r>
+        <w:rPr>
+          <w:cs/>
+          <w:lang w:bidi="hi-IN"/>
+        </w:rPr>
+        <w:t>आशा है कि तुम ठीक हो। मैं यहाँ ठीक हूँ।</w:t>
+      </w:r>
+    </w:p>
+    <w:p>
+      <w:r>
+        <w:rPr>
+          <w:cs/>
+          <w:lang w:bidi="hi-IN"/>
+        </w:rPr>
+        <w:t>मैं तुम्हें अपने बारे में कुछ बताना चाहता हूँ। मुझे किताबें पढ़ना बहुत पसंद है। मुझे खेल खेलना भी अच्छा लगता है। खाली समय में मैं साइकिल चलाता हूँ।</w:t>
+      </w:r>
+    </w:p>
+    <w:p>
+      <w:r>
+        <w:rPr>
+          <w:cs/>
+          <w:lang w:bidi="hi-IN"/>
+        </w:rPr>
+        <w:t>मुझे अपने शौक बहुत अच्छे लगते हैं। तुम अपने बारे में मुझे ज़रूर लिखना।</w:t>
+      </w:r>
+    </w:p>
+    <w:p>
+      <w:r>
+        <w:rPr>
+          <w:cs/>
+          <w:lang w:bidi="hi-IN"/>
+        </w:rPr>
+        <w:t>तुम्हारा मित्र</w:t>
+      </w:r>
+      <w:r>
+        <w:t>,</w:t>
+      </w:r>
+      <w:r>
+        <w:br/>
+      </w:r>
+      <w:r>
+        <w:rPr>
+          <w:cs/>
+          <w:lang w:bidi="hi-IN"/>
+        </w:rPr>
+        <w:t>त्रेयांश</w:t>
+      </w:r>
+    </w:p>
+    <w:p>
+      <w:r>
+        <w:pict w14:anchorId="40444A71">
+          <v:rect id="_x0000_i1090" style="width:0;height:1.5pt" o:hralign="center" o:hrstd="t" o:hr="t" fillcolor="#a0a0a0" stroked="f"/>
         </w:pict>
       </w:r>
     </w:p>
@@ -14407,6 +15314,468 @@
           <w:bCs/>
         </w:rPr>
         <w:lastRenderedPageBreak/>
+        <w:t>✉</w:t>
+      </w:r>
+      <w:r>
+        <w:rPr>
+          <w:b/>
+          <w:bCs/>
+        </w:rPr>
+        <w:t>️ 2️</w:t>
+      </w:r>
+      <w:r>
+        <w:rPr>
+          <w:rFonts w:ascii="Segoe UI Symbol" w:hAnsi="Segoe UI Symbol" w:cs="Segoe UI Symbol"/>
+          <w:b/>
+          <w:bCs/>
+        </w:rPr>
+        <w:t>⃣</w:t>
+      </w:r>
+      <w:r>
+        <w:rPr>
+          <w:b/>
+          <w:bCs/>
+        </w:rPr>
+        <w:t xml:space="preserve"> Nani (Favourite Book and Character)</w:t>
+      </w:r>
+    </w:p>
+    <w:p>
+      <w:r>
+        <w:rPr>
+          <w:cs/>
+          <w:lang w:bidi="hi-IN"/>
+        </w:rPr>
+        <w:t>पुणे</w:t>
+      </w:r>
+      <w:r>
+        <w:br/>
+      </w:r>
+      <w:r>
+        <w:rPr>
+          <w:cs/>
+          <w:lang w:bidi="hi-IN"/>
+        </w:rPr>
+        <w:t xml:space="preserve">दिनांक: </w:t>
+      </w:r>
+      <w:r>
+        <w:t xml:space="preserve">3 </w:t>
+      </w:r>
+      <w:r>
+        <w:rPr>
+          <w:cs/>
+          <w:lang w:bidi="hi-IN"/>
+        </w:rPr>
+        <w:t xml:space="preserve">मार्च </w:t>
+      </w:r>
+      <w:r>
+        <w:t>2026</w:t>
+      </w:r>
+    </w:p>
+    <w:p>
+      <w:r>
+        <w:rPr>
+          <w:cs/>
+          <w:lang w:bidi="hi-IN"/>
+        </w:rPr>
+        <w:t>आदरणीय नानी जी</w:t>
+      </w:r>
+      <w:r>
+        <w:t>,</w:t>
+      </w:r>
+    </w:p>
+    <w:p>
+      <w:r>
+        <w:rPr>
+          <w:cs/>
+          <w:lang w:bidi="hi-IN"/>
+        </w:rPr>
+        <w:t>नमस्ते। आप कैसी हैं</w:t>
+      </w:r>
+      <w:r>
+        <w:t xml:space="preserve">? </w:t>
+      </w:r>
+      <w:r>
+        <w:rPr>
+          <w:cs/>
+          <w:lang w:bidi="hi-IN"/>
+        </w:rPr>
+        <w:t>आशा है कि आप ठीक हैं। मैं यहाँ ठीक हूँ।</w:t>
+      </w:r>
+    </w:p>
+    <w:p>
+      <w:r>
+        <w:rPr>
+          <w:cs/>
+          <w:lang w:bidi="hi-IN"/>
+        </w:rPr>
+        <w:t>मैं आपको अपनी पसंदीदा किताब के बारे में बताना चाहता हूँ। मेरी पसंदीदा किताब “पंचतंत्र” है। मुझे यह किताब बहुत पसंद है।</w:t>
+      </w:r>
+    </w:p>
+    <w:p>
+      <w:r>
+        <w:rPr>
+          <w:cs/>
+          <w:lang w:bidi="hi-IN"/>
+        </w:rPr>
+        <w:t>इस किताब का मेरा पसंदीदा पात्र चतुर खरगोश है। वह बहुत समझदार और साहसी है।</w:t>
+      </w:r>
+    </w:p>
+    <w:p>
+      <w:r>
+        <w:rPr>
+          <w:cs/>
+          <w:lang w:bidi="hi-IN"/>
+        </w:rPr>
+        <w:t>जल्दी मिलते हैं।</w:t>
+      </w:r>
+    </w:p>
+    <w:p>
+      <w:r>
+        <w:rPr>
+          <w:cs/>
+          <w:lang w:bidi="hi-IN"/>
+        </w:rPr>
+        <w:t>आपका प्यारा</w:t>
+      </w:r>
+      <w:r>
+        <w:t>,</w:t>
+      </w:r>
+      <w:r>
+        <w:br/>
+      </w:r>
+      <w:r>
+        <w:rPr>
+          <w:cs/>
+          <w:lang w:bidi="hi-IN"/>
+        </w:rPr>
+        <w:t>त्रेयांश</w:t>
+      </w:r>
+    </w:p>
+    <w:p>
+      <w:r>
+        <w:pict w14:anchorId="16E89696">
+          <v:rect id="_x0000_i1091" style="width:0;height:1.5pt" o:hralign="center" o:hrstd="t" o:hr="t" fillcolor="#a0a0a0" stroked="f"/>
+        </w:pict>
+      </w:r>
+    </w:p>
+    <w:p>
+      <w:pPr>
+        <w:rPr>
+          <w:b/>
+          <w:bCs/>
+        </w:rPr>
+      </w:pPr>
+      <w:r>
+        <w:rPr>
+          <w:rFonts w:ascii="Segoe UI Symbol" w:hAnsi="Segoe UI Symbol" w:cs="Segoe UI Symbol"/>
+          <w:b/>
+          <w:bCs/>
+        </w:rPr>
+        <w:t>✉</w:t>
+      </w:r>
+      <w:r>
+        <w:rPr>
+          <w:b/>
+          <w:bCs/>
+        </w:rPr>
+        <w:t>️ 3️</w:t>
+      </w:r>
+      <w:r>
+        <w:rPr>
+          <w:rFonts w:ascii="Segoe UI Symbol" w:hAnsi="Segoe UI Symbol" w:cs="Segoe UI Symbol"/>
+          <w:b/>
+          <w:bCs/>
+        </w:rPr>
+        <w:t>⃣</w:t>
+      </w:r>
+      <w:r>
+        <w:rPr>
+          <w:b/>
+          <w:bCs/>
+        </w:rPr>
+        <w:t xml:space="preserve"> Mother (From Nani’s House)</w:t>
+      </w:r>
+    </w:p>
+    <w:p>
+      <w:r>
+        <w:rPr>
+          <w:cs/>
+          <w:lang w:bidi="hi-IN"/>
+        </w:rPr>
+        <w:t>नानी का घर</w:t>
+      </w:r>
+      <w:r>
+        <w:br/>
+      </w:r>
+      <w:r>
+        <w:rPr>
+          <w:cs/>
+          <w:lang w:bidi="hi-IN"/>
+        </w:rPr>
+        <w:t xml:space="preserve">दिनांक: </w:t>
+      </w:r>
+      <w:r>
+        <w:t xml:space="preserve">3 </w:t>
+      </w:r>
+      <w:r>
+        <w:rPr>
+          <w:cs/>
+          <w:lang w:bidi="hi-IN"/>
+        </w:rPr>
+        <w:t xml:space="preserve">मार्च </w:t>
+      </w:r>
+      <w:r>
+        <w:t>2026</w:t>
+      </w:r>
+    </w:p>
+    <w:p>
+      <w:r>
+        <w:rPr>
+          <w:cs/>
+          <w:lang w:bidi="hi-IN"/>
+        </w:rPr>
+        <w:t>पूजनीय माँ</w:t>
+      </w:r>
+      <w:r>
+        <w:t>,</w:t>
+      </w:r>
+    </w:p>
+    <w:p>
+      <w:r>
+        <w:rPr>
+          <w:cs/>
+          <w:lang w:bidi="hi-IN"/>
+        </w:rPr>
+        <w:t>नमस्ते। आप कैसी हैं</w:t>
+      </w:r>
+      <w:r>
+        <w:t xml:space="preserve">? </w:t>
+      </w:r>
+      <w:r>
+        <w:rPr>
+          <w:cs/>
+          <w:lang w:bidi="hi-IN"/>
+        </w:rPr>
+        <w:t>आशा है कि आप ठीक हैं। मैं यहाँ ठीक हूँ।</w:t>
+      </w:r>
+    </w:p>
+    <w:p>
+      <w:r>
+        <w:rPr>
+          <w:cs/>
+          <w:lang w:bidi="hi-IN"/>
+        </w:rPr>
+        <w:t>मैं आपको अपने बारे में कुछ बताना चाहता हूँ। मैं यहाँ बहुत खुश हूँ। मैं रोज़ खेलता हूँ और सबके साथ समय बिताता हूँ।</w:t>
+      </w:r>
+    </w:p>
+    <w:p>
+      <w:r>
+        <w:rPr>
+          <w:cs/>
+          <w:lang w:bidi="hi-IN"/>
+        </w:rPr>
+        <w:t>मुझे यहाँ बहुत अच्छा लग रहा है। मैं आपको याद करता हूँ।</w:t>
+      </w:r>
+    </w:p>
+    <w:p>
+      <w:r>
+        <w:rPr>
+          <w:cs/>
+          <w:lang w:bidi="hi-IN"/>
+        </w:rPr>
+        <w:t>जल्दी मिलते हैं।</w:t>
+      </w:r>
+    </w:p>
+    <w:p>
+      <w:r>
+        <w:rPr>
+          <w:cs/>
+          <w:lang w:bidi="hi-IN"/>
+        </w:rPr>
+        <w:t>आपका बेटा</w:t>
+      </w:r>
+      <w:r>
+        <w:t>,</w:t>
+      </w:r>
+      <w:r>
+        <w:br/>
+      </w:r>
+      <w:r>
+        <w:rPr>
+          <w:cs/>
+          <w:lang w:bidi="hi-IN"/>
+        </w:rPr>
+        <w:t>त्रेयांश</w:t>
+      </w:r>
+    </w:p>
+    <w:p>
+      <w:r>
+        <w:lastRenderedPageBreak/>
+        <w:pict w14:anchorId="73E5C18B">
+          <v:rect id="_x0000_i1092" style="width:0;height:1.5pt" o:hralign="center" o:hrstd="t" o:hr="t" fillcolor="#a0a0a0" stroked="f"/>
+        </w:pict>
+      </w:r>
+    </w:p>
+    <w:p>
+      <w:pPr>
+        <w:rPr>
+          <w:b/>
+          <w:bCs/>
+        </w:rPr>
+      </w:pPr>
+      <w:r>
+        <w:rPr>
+          <w:rFonts w:ascii="Segoe UI Symbol" w:hAnsi="Segoe UI Symbol" w:cs="Segoe UI Symbol"/>
+          <w:b/>
+          <w:bCs/>
+        </w:rPr>
+        <w:t>✉</w:t>
+      </w:r>
+      <w:r>
+        <w:rPr>
+          <w:b/>
+          <w:bCs/>
+        </w:rPr>
+        <w:t>️ 4️</w:t>
+      </w:r>
+      <w:r>
+        <w:rPr>
+          <w:rFonts w:ascii="Segoe UI Symbol" w:hAnsi="Segoe UI Symbol" w:cs="Segoe UI Symbol"/>
+          <w:b/>
+          <w:bCs/>
+        </w:rPr>
+        <w:t>⃣</w:t>
+      </w:r>
+      <w:r>
+        <w:rPr>
+          <w:b/>
+          <w:bCs/>
+        </w:rPr>
+        <w:t xml:space="preserve"> Sick Friend Ekansh</w:t>
+      </w:r>
+    </w:p>
+    <w:p>
+      <w:r>
+        <w:rPr>
+          <w:cs/>
+          <w:lang w:bidi="hi-IN"/>
+        </w:rPr>
+        <w:t>पुणे</w:t>
+      </w:r>
+      <w:r>
+        <w:br/>
+      </w:r>
+      <w:r>
+        <w:rPr>
+          <w:cs/>
+          <w:lang w:bidi="hi-IN"/>
+        </w:rPr>
+        <w:t xml:space="preserve">दिनांक: </w:t>
+      </w:r>
+      <w:r>
+        <w:t xml:space="preserve">3 </w:t>
+      </w:r>
+      <w:r>
+        <w:rPr>
+          <w:cs/>
+          <w:lang w:bidi="hi-IN"/>
+        </w:rPr>
+        <w:t xml:space="preserve">मार्च </w:t>
+      </w:r>
+      <w:r>
+        <w:t>2026</w:t>
+      </w:r>
+    </w:p>
+    <w:p>
+      <w:r>
+        <w:rPr>
+          <w:cs/>
+          <w:lang w:bidi="hi-IN"/>
+        </w:rPr>
+        <w:t>प्रिय मित्र एकांश</w:t>
+      </w:r>
+      <w:r>
+        <w:t>,</w:t>
+      </w:r>
+    </w:p>
+    <w:p>
+      <w:r>
+        <w:rPr>
+          <w:cs/>
+          <w:lang w:bidi="hi-IN"/>
+        </w:rPr>
+        <w:t>नमस्ते। तुम कैसे हो</w:t>
+      </w:r>
+      <w:r>
+        <w:t xml:space="preserve">? </w:t>
+      </w:r>
+      <w:r>
+        <w:rPr>
+          <w:cs/>
+          <w:lang w:bidi="hi-IN"/>
+        </w:rPr>
+        <w:t>आशा है कि तुम जल्दी ठीक हो जाओ। मैं यहाँ ठीक हूँ।</w:t>
+      </w:r>
+    </w:p>
+    <w:p>
+      <w:r>
+        <w:rPr>
+          <w:cs/>
+          <w:lang w:bidi="hi-IN"/>
+        </w:rPr>
+        <w:t>मुझे पता चला कि तुम बीमार हो। तुम आराम करो और समय पर दवा लो।</w:t>
+      </w:r>
+    </w:p>
+    <w:p>
+      <w:r>
+        <w:rPr>
+          <w:cs/>
+          <w:lang w:bidi="hi-IN"/>
+        </w:rPr>
+        <w:t>मैं तुम्हारे लिए प्रार्थना करता हूँ। जल्दी मिलते हैं।</w:t>
+      </w:r>
+    </w:p>
+    <w:p>
+      <w:r>
+        <w:rPr>
+          <w:cs/>
+          <w:lang w:bidi="hi-IN"/>
+        </w:rPr>
+        <w:t>तुम्हारा मित्र</w:t>
+      </w:r>
+      <w:r>
+        <w:t>,</w:t>
+      </w:r>
+      <w:r>
+        <w:br/>
+      </w:r>
+      <w:r>
+        <w:rPr>
+          <w:cs/>
+          <w:lang w:bidi="hi-IN"/>
+        </w:rPr>
+        <w:t>त्रेयांश</w:t>
+      </w:r>
+    </w:p>
+    <w:p/>
+    <w:p>
+      <w:pPr>
+        <w:pStyle w:val="ListParagraph"/>
+        <w:numPr>
+          <w:ilvl w:val="0"/>
+          <w:numId w:val="62"/>
+        </w:numPr>
+        <w:rPr>
+          <w:b/>
+          <w:bCs/>
+        </w:rPr>
+      </w:pPr>
+      <w:r>
+        <w:rPr>
+          <w:rFonts w:ascii="Segoe UI Symbol" w:hAnsi="Segoe UI Symbol" w:cs="Segoe UI Symbol"/>
+          <w:b/>
+          <w:bCs/>
+        </w:rPr>
         <w:t>✍</w:t>
       </w:r>
       <w:r>
@@ -14577,7 +15946,7 @@
     <w:p>
       <w:r>
         <w:pict w14:anchorId="44BD9182">
-          <v:rect id="_x0000_i1176" style="width:0;height:.75pt" o:hralign="center" o:hrstd="t" o:hr="t" fillcolor="#a0a0a0" stroked="f"/>
+          <v:rect id="_x0000_i1033" style="width:0;height:.75pt" o:hralign="center" o:hrstd="t" o:hr="t" fillcolor="#a0a0a0" stroked="f"/>
         </w:pict>
       </w:r>
     </w:p>
@@ -14657,6 +16026,7 @@
         </w:numPr>
       </w:pPr>
       <w:r>
+        <w:lastRenderedPageBreak/>
         <w:t xml:space="preserve">______ </w:t>
       </w:r>
       <w:r>
@@ -14834,9 +16204,8 @@
     </w:p>
     <w:p>
       <w:r>
-        <w:lastRenderedPageBreak/>
         <w:pict w14:anchorId="3783F6FA">
-          <v:rect id="_x0000_i1177" style="width:0;height:.75pt" o:hralign="center" o:hrstd="t" o:hr="t" fillcolor="#a0a0a0" stroked="f"/>
+          <v:rect id="_x0000_i1034" style="width:0;height:.75pt" o:hralign="center" o:hrstd="t" o:hr="t" fillcolor="#a0a0a0" stroked="f"/>
         </w:pict>
       </w:r>
     </w:p>
@@ -14983,6 +16352,7 @@
           <w:bCs/>
           <w:lang w:bidi="hi-IN"/>
         </w:rPr>
+        <w:lastRenderedPageBreak/>
         <w:t>My first train journey is an important part of life. Travel has special importance in our daily life.</w:t>
       </w:r>
     </w:p>
@@ -15083,7 +16453,7 @@
           <w:bCs/>
         </w:rPr>
         <w:pict w14:anchorId="74E7F33A">
-          <v:rect id="_x0000_i1239" style="width:0;height:1.5pt" o:hralign="center" o:hrstd="t" o:hr="t" fillcolor="#a0a0a0" stroked="f"/>
+          <v:rect id="_x0000_i1035" style="width:0;height:1.5pt" o:hralign="center" o:hrstd="t" o:hr="t" fillcolor="#a0a0a0" stroked="f"/>
         </w:pict>
       </w:r>
     </w:p>
@@ -15190,7 +16560,6 @@
           <w:b/>
           <w:bCs/>
         </w:rPr>
-        <w:lastRenderedPageBreak/>
         <w:t>My First Shopping Experience</w:t>
       </w:r>
     </w:p>
@@ -15302,7 +16671,7 @@
           <w:bCs/>
         </w:rPr>
         <w:pict w14:anchorId="016AFE45">
-          <v:rect id="_x0000_i1240" style="width:0;height:1.5pt" o:hralign="center" o:hrstd="t" o:hr="t" fillcolor="#a0a0a0" stroked="f"/>
+          <v:rect id="_x0000_i1036" style="width:0;height:1.5pt" o:hralign="center" o:hrstd="t" o:hr="t" fillcolor="#a0a0a0" stroked="f"/>
         </w:pict>
       </w:r>
     </w:p>
@@ -15359,6 +16728,7 @@
           <w:cs/>
           <w:lang w:bidi="hi-IN"/>
         </w:rPr>
+        <w:lastRenderedPageBreak/>
         <w:t>किताबों की दुकान हमारे जीवन का एक महत्वपूर्ण हिस्सा है। किताबों का हमारे दैनिक जीवन में विशेष महत्व है।</w:t>
       </w:r>
     </w:p>
@@ -15528,7 +16898,7 @@
           <w:bCs/>
         </w:rPr>
         <w:pict w14:anchorId="00A95CD6">
-          <v:rect id="_x0000_i1241" style="width:0;height:1.5pt" o:hralign="center" o:hrstd="t" o:hr="t" fillcolor="#a0a0a0" stroked="f"/>
+          <v:rect id="_x0000_i1037" style="width:0;height:1.5pt" o:hralign="center" o:hrstd="t" o:hr="t" fillcolor="#a0a0a0" stroked="f"/>
         </w:pict>
       </w:r>
     </w:p>
@@ -15585,7 +16955,6 @@
           <w:cs/>
           <w:lang w:bidi="hi-IN"/>
         </w:rPr>
-        <w:lastRenderedPageBreak/>
         <w:t>खिलौने हमारे जीवन का एक महत्वपूर्ण हिस्सा हैं। खिलौनों का बच्चों के जीवन में विशेष महत्व है।</w:t>
       </w:r>
     </w:p>
@@ -15693,6 +17062,7 @@
           <w:b/>
           <w:bCs/>
         </w:rPr>
+        <w:lastRenderedPageBreak/>
         <w:t>They have many benefits, such as they give us happiness and entertain us.</w:t>
       </w:r>
     </w:p>
@@ -15755,7 +17125,7 @@
           <w:bCs/>
         </w:rPr>
         <w:pict w14:anchorId="7C5B20F5">
-          <v:rect id="_x0000_i1242" style="width:0;height:1.5pt" o:hralign="center" o:hrstd="t" o:hr="t" fillcolor="#a0a0a0" stroked="f"/>
+          <v:rect id="_x0000_i1038" style="width:0;height:1.5pt" o:hralign="center" o:hrstd="t" o:hr="t" fillcolor="#a0a0a0" stroked="f"/>
         </w:pict>
       </w:r>
     </w:p>
@@ -15919,7 +17289,6 @@
           <w:b/>
           <w:bCs/>
         </w:rPr>
-        <w:lastRenderedPageBreak/>
         <w:t>They have many benefits, such as they bring happiness on special occasions.</w:t>
       </w:r>
     </w:p>
@@ -15982,7 +17351,7 @@
           <w:bCs/>
         </w:rPr>
         <w:pict w14:anchorId="4F0C4A94">
-          <v:rect id="_x0000_i1243" style="width:0;height:1.5pt" o:hralign="center" o:hrstd="t" o:hr="t" fillcolor="#a0a0a0" stroked="f"/>
+          <v:rect id="_x0000_i1039" style="width:0;height:1.5pt" o:hralign="center" o:hrstd="t" o:hr="t" fillcolor="#a0a0a0" stroked="f"/>
         </w:pict>
       </w:r>
     </w:p>
@@ -16056,6 +17425,7 @@
           <w:cs/>
           <w:lang w:bidi="hi-IN"/>
         </w:rPr>
+        <w:lastRenderedPageBreak/>
         <w:t>सबसे पहले तो यह कहा जा सकता है कि मुझे झूठ बोलना पसंद नहीं है। इसके कई नुकसान हैं जैसे कि इससे विश्वास टूट जाता है। यह हमें सिखाता है कि हमें हमेशा सच्चाई का साथ देना चाहिए।</w:t>
       </w:r>
     </w:p>
@@ -16253,104 +17623,104 @@
           <w:cs/>
           <w:lang w:bidi="hi-IN"/>
         </w:rPr>
+        <w:t>इस दिन लोग अपने घरों को साफ करते हैं और दीये जलाते हैं। बच्चे पटाखे जलाते हैं और मिठाइयाँ बाँटी जाती हैं। यह त्योहार हमें सिखाता है कि अच्छाई पर बुराई की हमेशा जीत होती है।</w:t>
+      </w:r>
+    </w:p>
+    <w:p>
+      <w:r>
+        <w:rPr>
+          <w:cs/>
+          <w:lang w:bidi="hi-IN"/>
+        </w:rPr>
+        <w:t>अतः हम कह सकते हैं कि दिवाली खुशियों और उजाले का त्योहार है।</w:t>
+      </w:r>
+    </w:p>
+    <w:p>
+      <w:pPr>
+        <w:rPr>
+          <w:b/>
+          <w:bCs/>
+        </w:rPr>
+      </w:pPr>
+      <w:r>
+        <w:rPr>
+          <w:b/>
+          <w:bCs/>
+          <w:cs/>
+          <w:lang w:bidi="hi-IN"/>
+        </w:rPr>
+        <w:t xml:space="preserve">उदाहरण </w:t>
+      </w:r>
+      <w:r>
+        <w:rPr>
+          <w:b/>
+          <w:bCs/>
+        </w:rPr>
+        <w:t xml:space="preserve">2: </w:t>
+      </w:r>
+      <w:r>
+        <w:rPr>
+          <w:b/>
+          <w:bCs/>
+          <w:cs/>
+          <w:lang w:bidi="hi-IN"/>
+        </w:rPr>
+        <w:t>पेड़ों का महत्व</w:t>
+      </w:r>
+    </w:p>
+    <w:p>
+      <w:r>
+        <w:rPr>
+          <w:b/>
+          <w:bCs/>
+          <w:cs/>
+          <w:lang w:bidi="hi-IN"/>
+        </w:rPr>
+        <w:t>शीर्षक: पेड़ - हमारे सच्चे मित्र</w:t>
+      </w:r>
+    </w:p>
+    <w:p>
+      <w:r>
+        <w:rPr>
+          <w:cs/>
+          <w:lang w:bidi="hi-IN"/>
+        </w:rPr>
+        <w:t>पेड़ों का हमारे जीवन में बहुत महत्व है। ये हमें फल</w:t>
+      </w:r>
+      <w:r>
+        <w:t xml:space="preserve">, </w:t>
+      </w:r>
+      <w:r>
+        <w:rPr>
+          <w:cs/>
+          <w:lang w:bidi="hi-IN"/>
+        </w:rPr>
+        <w:t>फूल और लकड़ी देते हैं।</w:t>
+      </w:r>
+    </w:p>
+    <w:p>
+      <w:r>
+        <w:rPr>
+          <w:cs/>
+          <w:lang w:bidi="hi-IN"/>
+        </w:rPr>
+        <w:t>सबसे पहले तो यह कहा जा सकता है कि पेड़ हमें ऑक्सीजन देते हैं। ये वातावरण को शुद्ध रखते हैं और वर्षा लाने में मदद करते हैं। इनके बिना जीवन की कल्पना करना कठिन है।</w:t>
+      </w:r>
+    </w:p>
+    <w:p>
+      <w:r>
+        <w:rPr>
+          <w:cs/>
+          <w:lang w:bidi="hi-IN"/>
+        </w:rPr>
         <w:lastRenderedPageBreak/>
-        <w:t>इस दिन लोग अपने घरों को साफ करते हैं और दीये जलाते हैं। बच्चे पटाखे जलाते हैं और मिठाइयाँ बाँटी जाती हैं। यह त्योहार हमें सिखाता है कि अच्छाई पर बुराई की हमेशा जीत होती है।</w:t>
-      </w:r>
-    </w:p>
-    <w:p>
-      <w:r>
-        <w:rPr>
-          <w:cs/>
-          <w:lang w:bidi="hi-IN"/>
-        </w:rPr>
-        <w:t>अतः हम कह सकते हैं कि दिवाली खुशियों और उजाले का त्योहार है।</w:t>
-      </w:r>
-    </w:p>
-    <w:p>
-      <w:pPr>
-        <w:rPr>
-          <w:b/>
-          <w:bCs/>
-        </w:rPr>
-      </w:pPr>
-      <w:r>
-        <w:rPr>
-          <w:b/>
-          <w:bCs/>
-          <w:cs/>
-          <w:lang w:bidi="hi-IN"/>
-        </w:rPr>
-        <w:t xml:space="preserve">उदाहरण </w:t>
-      </w:r>
-      <w:r>
-        <w:rPr>
-          <w:b/>
-          <w:bCs/>
-        </w:rPr>
-        <w:t xml:space="preserve">2: </w:t>
-      </w:r>
-      <w:r>
-        <w:rPr>
-          <w:b/>
-          <w:bCs/>
-          <w:cs/>
-          <w:lang w:bidi="hi-IN"/>
-        </w:rPr>
-        <w:t>पेड़ों का महत्व</w:t>
-      </w:r>
-    </w:p>
-    <w:p>
-      <w:r>
-        <w:rPr>
-          <w:b/>
-          <w:bCs/>
-          <w:cs/>
-          <w:lang w:bidi="hi-IN"/>
-        </w:rPr>
-        <w:t>शीर्षक: पेड़ - हमारे सच्चे मित्र</w:t>
-      </w:r>
-    </w:p>
-    <w:p>
-      <w:r>
-        <w:rPr>
-          <w:cs/>
-          <w:lang w:bidi="hi-IN"/>
-        </w:rPr>
-        <w:t>पेड़ों का हमारे जीवन में बहुत महत्व है। ये हमें फल</w:t>
-      </w:r>
-      <w:r>
-        <w:t xml:space="preserve">, </w:t>
-      </w:r>
-      <w:r>
-        <w:rPr>
-          <w:cs/>
-          <w:lang w:bidi="hi-IN"/>
-        </w:rPr>
-        <w:t>फूल और लकड़ी देते हैं।</w:t>
-      </w:r>
-    </w:p>
-    <w:p>
-      <w:r>
-        <w:rPr>
-          <w:cs/>
-          <w:lang w:bidi="hi-IN"/>
-        </w:rPr>
-        <w:t>सबसे पहले तो यह कहा जा सकता है कि पेड़ हमें ऑक्सीजन देते हैं। ये वातावरण को शुद्ध रखते हैं और वर्षा लाने में मदद करते हैं। इनके बिना जीवन की कल्पना करना कठिन है।</w:t>
-      </w:r>
-    </w:p>
-    <w:p>
-      <w:r>
-        <w:rPr>
-          <w:cs/>
-          <w:lang w:bidi="hi-IN"/>
-        </w:rPr>
         <w:t>अतः हमें अधिक से अधिक पेड़ लगाने चाहिए और उनकी रक्षा करनी चाहिए।</w:t>
       </w:r>
     </w:p>
     <w:p>
       <w:r>
         <w:pict w14:anchorId="5CA6AAFD">
-          <v:rect id="_x0000_i1178" style="width:0;height:.75pt" o:hralign="center" o:hrstd="t" o:hr="t" fillcolor="#a0a0a0" stroked="f"/>
+          <v:rect id="_x0000_i1040" style="width:0;height:.75pt" o:hralign="center" o:hrstd="t" o:hr="t" fillcolor="#a0a0a0" stroked="f"/>
         </w:pict>
       </w:r>
     </w:p>
@@ -16711,7 +18081,7 @@
     <w:p>
       <w:r>
         <w:pict w14:anchorId="00FA8168">
-          <v:rect id="_x0000_i1179" style="width:0;height:.75pt" o:hralign="center" o:hrstd="t" o:hr="t" fillcolor="#a0a0a0" stroked="f"/>
+          <v:rect id="_x0000_i1041" style="width:0;height:.75pt" o:hralign="center" o:hrstd="t" o:hr="t" fillcolor="#a0a0a0" stroked="f"/>
         </w:pict>
       </w:r>
     </w:p>
@@ -16768,7 +18138,6 @@
           <w:cs/>
           <w:lang w:bidi="hi-IN"/>
         </w:rPr>
-        <w:lastRenderedPageBreak/>
         <w:t>एक ही वाक्य से अलग-अलग पत्र:</w:t>
       </w:r>
     </w:p>
@@ -17165,7 +18534,7 @@
     <w:p>
       <w:r>
         <w:pict w14:anchorId="25432FED">
-          <v:rect id="_x0000_i1180" style="width:0;height:.75pt" o:hralign="center" o:hrstd="t" o:hr="t" fillcolor="#a0a0a0" stroked="f"/>
+          <v:rect id="_x0000_i1042" style="width:0;height:.75pt" o:hralign="center" o:hrstd="t" o:hr="t" fillcolor="#a0a0a0" stroked="f"/>
         </w:pict>
       </w:r>
     </w:p>
@@ -17182,6 +18551,7 @@
           <w:b/>
           <w:bCs/>
         </w:rPr>
+        <w:lastRenderedPageBreak/>
         <w:t>📖</w:t>
       </w:r>
       <w:r>
@@ -17690,7 +19060,6 @@
           <w:cs/>
           <w:lang w:bidi="hi-IN"/>
         </w:rPr>
-        <w:lastRenderedPageBreak/>
         <w:t>मेरे पास हरी</w:t>
       </w:r>
       <w:r>
@@ -17749,7 +19118,7 @@
     <w:p>
       <w:r>
         <w:pict w14:anchorId="1D9252F8">
-          <v:rect id="_x0000_i1181" style="width:0;height:.75pt" o:hralign="center" o:hrstd="t" o:hr="t" fillcolor="#a0a0a0" stroked="f"/>
+          <v:rect id="_x0000_i1043" style="width:0;height:.75pt" o:hralign="center" o:hrstd="t" o:hr="t" fillcolor="#a0a0a0" stroked="f"/>
         </w:pict>
       </w:r>
     </w:p>
@@ -17869,7 +19238,7 @@
     <w:p>
       <w:r>
         <w:pict w14:anchorId="1185B818">
-          <v:rect id="_x0000_i1182" style="width:0;height:.75pt" o:hralign="center" o:hrstd="t" o:hr="t" fillcolor="#a0a0a0" stroked="f"/>
+          <v:rect id="_x0000_i1044" style="width:0;height:.75pt" o:hralign="center" o:hrstd="t" o:hr="t" fillcolor="#a0a0a0" stroked="f"/>
         </w:pict>
       </w:r>
     </w:p>
@@ -17950,6 +19319,7 @@
                 <w:cs/>
                 <w:lang w:bidi="hi-IN"/>
               </w:rPr>
+              <w:lastRenderedPageBreak/>
               <w:t>काल</w:t>
             </w:r>
           </w:p>
@@ -18300,7 +19670,7 @@
     <w:p>
       <w:r>
         <w:pict w14:anchorId="51F43132">
-          <v:rect id="_x0000_i1183" style="width:0;height:.75pt" o:hralign="center" o:hrstd="t" o:hr="t" fillcolor="#a0a0a0" stroked="f"/>
+          <v:rect id="_x0000_i1045" style="width:0;height:.75pt" o:hralign="center" o:hrstd="t" o:hr="t" fillcolor="#a0a0a0" stroked="f"/>
         </w:pict>
       </w:r>
     </w:p>
@@ -18637,7 +20007,6 @@
           </w:tcPr>
           <w:p>
             <w:r>
-              <w:lastRenderedPageBreak/>
               <w:t>4</w:t>
             </w:r>
           </w:p>
@@ -18894,6 +20263,7 @@
           </w:tcPr>
           <w:p>
             <w:r>
+              <w:lastRenderedPageBreak/>
               <w:t>8</w:t>
             </w:r>
           </w:p>
@@ -19203,7 +20573,7 @@
     <w:p>
       <w:r>
         <w:pict w14:anchorId="20101D66">
-          <v:rect id="_x0000_i1184" style="width:0;height:.75pt" o:hralign="center" o:hrstd="t" o:hr="t" fillcolor="#a0a0a0" stroked="f"/>
+          <v:rect id="_x0000_i1046" style="width:0;height:.75pt" o:hralign="center" o:hrstd="t" o:hr="t" fillcolor="#a0a0a0" stroked="f"/>
         </w:pict>
       </w:r>
     </w:p>
@@ -19395,7 +20765,6 @@
                 <w:cs/>
                 <w:lang w:bidi="hi-IN"/>
               </w:rPr>
-              <w:lastRenderedPageBreak/>
               <w:t>पानी</w:t>
             </w:r>
           </w:p>
@@ -19660,6 +21029,7 @@
                 <w:cs/>
                 <w:lang w:bidi="hi-IN"/>
               </w:rPr>
+              <w:lastRenderedPageBreak/>
               <w:t>मनुष्य</w:t>
             </w:r>
           </w:p>
@@ -19711,7 +21081,7 @@
     <w:p>
       <w:r>
         <w:pict w14:anchorId="2544A620">
-          <v:rect id="_x0000_i1185" style="width:0;height:.75pt" o:hralign="center" o:hrstd="t" o:hr="t" fillcolor="#a0a0a0" stroked="f"/>
+          <v:rect id="_x0000_i1047" style="width:0;height:.75pt" o:hralign="center" o:hrstd="t" o:hr="t" fillcolor="#a0a0a0" stroked="f"/>
         </w:pict>
       </w:r>
     </w:p>
@@ -20067,7 +21437,6 @@
                 <w:cs/>
                 <w:lang w:bidi="hi-IN"/>
               </w:rPr>
-              <w:lastRenderedPageBreak/>
               <w:t>सुबह</w:t>
             </w:r>
           </w:p>
@@ -20145,7 +21514,7 @@
     <w:p>
       <w:r>
         <w:pict w14:anchorId="55A5EBD2">
-          <v:rect id="_x0000_i1186" style="width:0;height:.75pt" o:hralign="center" o:hrstd="t" o:hr="t" fillcolor="#a0a0a0" stroked="f"/>
+          <v:rect id="_x0000_i1048" style="width:0;height:.75pt" o:hralign="center" o:hrstd="t" o:hr="t" fillcolor="#a0a0a0" stroked="f"/>
         </w:pict>
       </w:r>
     </w:p>
@@ -20218,6 +21587,7 @@
                 <w:cs/>
                 <w:lang w:bidi="hi-IN"/>
               </w:rPr>
+              <w:lastRenderedPageBreak/>
               <w:t>तत्सम</w:t>
             </w:r>
           </w:p>
@@ -20525,7 +21895,7 @@
     <w:p>
       <w:r>
         <w:pict w14:anchorId="5954BB18">
-          <v:rect id="_x0000_i1187" style="width:0;height:.75pt" o:hralign="center" o:hrstd="t" o:hr="t" fillcolor="#a0a0a0" stroked="f"/>
+          <v:rect id="_x0000_i1049" style="width:0;height:.75pt" o:hralign="center" o:hrstd="t" o:hr="t" fillcolor="#a0a0a0" stroked="f"/>
         </w:pict>
       </w:r>
     </w:p>
@@ -20598,7 +21968,6 @@
                 <w:cs/>
                 <w:lang w:bidi="hi-IN"/>
               </w:rPr>
-              <w:lastRenderedPageBreak/>
               <w:t>वाक्यांश</w:t>
             </w:r>
           </w:p>
@@ -20829,6 +22198,7 @@
                 <w:cs/>
                 <w:lang w:bidi="hi-IN"/>
               </w:rPr>
+              <w:lastRenderedPageBreak/>
               <w:t>साथ पढ़ने वाला</w:t>
             </w:r>
           </w:p>
@@ -20860,7 +22230,7 @@
     <w:p>
       <w:r>
         <w:pict w14:anchorId="229A5F76">
-          <v:rect id="_x0000_i1188" style="width:0;height:.75pt" o:hralign="center" o:hrstd="t" o:hr="t" fillcolor="#a0a0a0" stroked="f"/>
+          <v:rect id="_x0000_i1050" style="width:0;height:.75pt" o:hralign="center" o:hrstd="t" o:hr="t" fillcolor="#a0a0a0" stroked="f"/>
         </w:pict>
       </w:r>
     </w:p>
@@ -21391,7 +22761,6 @@
                 <w:cs/>
                 <w:lang w:bidi="hi-IN"/>
               </w:rPr>
-              <w:lastRenderedPageBreak/>
               <w:t>पूँछ</w:t>
             </w:r>
           </w:p>
@@ -21467,7 +22836,7 @@
     <w:p>
       <w:r>
         <w:pict w14:anchorId="174D003F">
-          <v:rect id="_x0000_i1189" style="width:0;height:.75pt" o:hralign="center" o:hrstd="t" o:hr="t" fillcolor="#a0a0a0" stroked="f"/>
+          <v:rect id="_x0000_i1051" style="width:0;height:.75pt" o:hralign="center" o:hrstd="t" o:hr="t" fillcolor="#a0a0a0" stroked="f"/>
         </w:pict>
       </w:r>
     </w:p>
@@ -21684,6 +23053,7 @@
                 <w:cs/>
                 <w:lang w:bidi="hi-IN"/>
               </w:rPr>
+              <w:lastRenderedPageBreak/>
               <w:t>नौ दो ग्यारह होना</w:t>
             </w:r>
           </w:p>
@@ -21941,7 +23311,7 @@
     <w:p>
       <w:r>
         <w:pict w14:anchorId="000F2438">
-          <v:rect id="_x0000_i1190" style="width:0;height:.75pt" o:hralign="center" o:hrstd="t" o:hr="t" fillcolor="#a0a0a0" stroked="f"/>
+          <v:rect id="_x0000_i1052" style="width:0;height:.75pt" o:hralign="center" o:hrstd="t" o:hr="t" fillcolor="#a0a0a0" stroked="f"/>
         </w:pict>
       </w:r>
     </w:p>
@@ -22115,7 +23485,6 @@
           <w:cs/>
           <w:lang w:bidi="hi-IN"/>
         </w:rPr>
-        <w:lastRenderedPageBreak/>
         <w:t>बस! तुम्हारा पत्र या अनुच्छेद तैयार!</w:t>
       </w:r>
     </w:p>
@@ -22132,6 +23501,11 @@
 
 <file path=word/numbering.xml><?xml version="1.0" encoding="utf-8"?>
 <w:numbering xmlns:wpc="http://schemas.microsoft.com/office/word/2010/wordprocessingCanvas" xmlns:cx="http://schemas.microsoft.com/office/drawing/2014/chartex" xmlns:cx1="http://schemas.microsoft.com/office/drawing/2015/9/8/chartex" xmlns:cx2="http://schemas.microsoft.com/office/drawing/2015/10/21/chartex" xmlns:cx3="http://schemas.microsoft.com/office/drawing/2016/5/9/chartex" xmlns:cx4="http://schemas.microsoft.com/office/drawing/2016/5/10/chartex" xmlns:cx5="http://schemas.microsoft.com/office/drawing/2016/5/11/chartex" xmlns:cx6="http://schemas.microsoft.com/office/drawing/2016/5/12/chartex" xmlns:cx7="http://schemas.microsoft.com/office/drawing/2016/5/13/chartex" xmlns:cx8="http://schemas.microsoft.com/office/drawing/2016/5/14/chartex" xmlns:mc="http://schemas.openxmlformats.org/markup-compatibility/2006" xmlns:aink="http://schemas.microsoft.com/office/drawing/2016/ink" xmlns:am3d="http://schemas.microsoft.com/office/drawing/2017/model3d" xmlns:o="urn:schemas-microsoft-com:office:office" xmlns:oel="http://schemas.microsoft.com/office/2019/extlst" xmlns:r="http://schemas.openxmlformats.org/officeDocument/2006/relationships" xmlns:m="http://schemas.openxmlformats.org/officeDocument/2006/math" xmlns:v="urn:schemas-microsoft-com:vml" xmlns:wp14="http://schemas.microsoft.com/office/word/2010/wordprocessingDrawing" xmlns:wp="http://schemas.openxmlformats.org/drawingml/2006/wordprocessingDrawing" xmlns:w10="urn:schemas-microsoft-com:office:word" xmlns:w="http://schemas.openxmlformats.org/wordprocessingml/2006/main" xmlns:w14="http://schemas.microsoft.com/office/word/2010/wordml" xmlns:w15="http://schemas.microsoft.com/office/word/2012/wordml" xmlns:w16cex="http://schemas.microsoft.com/office/word/2018/wordml/cex" xmlns:w16cid="http://schemas.microsoft.com/office/word/2016/wordml/cid" xmlns:w16="http://schemas.microsoft.com/office/word/2018/wordml" xmlns:w16sdtdh="http://schemas.microsoft.com/office/word/2020/wordml/sdtdatahash" xmlns:w16se="http://schemas.microsoft.com/office/word/2015/wordml/symex" xmlns:wpg="http://schemas.microsoft.com/office/word/2010/wordprocessingGroup" xmlns:wpi="http://schemas.microsoft.com/office/word/2010/wordprocessingInk" xmlns:wne="http://schemas.microsoft.com/office/word/2006/wordml" xmlns:wps="http://schemas.microsoft.com/office/word/2010/wordprocessingShape" mc:Ignorable="w14 w15 w16se w16cid w16 w16cex w16sdtdh wp14">
+  <w:numPicBullet w:numPicBulletId="0">
+    <w:pict>
+      <v:rect id="_x0000_i1043" style="width:0;height:.75pt" o:hralign="center" o:bullet="t" o:hrstd="t" o:hr="t" fillcolor="#a0a0a0" stroked="f"/>
+    </w:pict>
+  </w:numPicBullet>
   <w:abstractNum w:abstractNumId="0" w15:restartNumberingAfterBreak="0">
     <w:nsid w:val="005F6AE0"/>
     <w:multiLevelType w:val="multilevel"/>
@@ -23298,6 +24672,155 @@
     </w:lvl>
   </w:abstractNum>
   <w:abstractNum w:abstractNumId="9" w15:restartNumberingAfterBreak="0">
+    <w:nsid w:val="11215316"/>
+    <w:multiLevelType w:val="multilevel"/>
+    <w:tmpl w:val="6CC654F0"/>
+    <w:lvl w:ilvl="0">
+      <w:start w:val="1"/>
+      <w:numFmt w:val="bullet"/>
+      <w:lvlText w:val=""/>
+      <w:lvlJc w:val="left"/>
+      <w:pPr>
+        <w:tabs>
+          <w:tab w:val="num" w:pos="720"/>
+        </w:tabs>
+        <w:ind w:left="720" w:hanging="360"/>
+      </w:pPr>
+      <w:rPr>
+        <w:rFonts w:ascii="Symbol" w:hAnsi="Symbol" w:hint="default"/>
+        <w:sz w:val="20"/>
+      </w:rPr>
+    </w:lvl>
+    <w:lvl w:ilvl="1" w:tentative="1">
+      <w:start w:val="1"/>
+      <w:numFmt w:val="bullet"/>
+      <w:lvlText w:val="o"/>
+      <w:lvlJc w:val="left"/>
+      <w:pPr>
+        <w:tabs>
+          <w:tab w:val="num" w:pos="1440"/>
+        </w:tabs>
+        <w:ind w:left="1440" w:hanging="360"/>
+      </w:pPr>
+      <w:rPr>
+        <w:rFonts w:ascii="Courier New" w:hAnsi="Courier New" w:hint="default"/>
+        <w:sz w:val="20"/>
+      </w:rPr>
+    </w:lvl>
+    <w:lvl w:ilvl="2" w:tentative="1">
+      <w:start w:val="1"/>
+      <w:numFmt w:val="bullet"/>
+      <w:lvlText w:val=""/>
+      <w:lvlJc w:val="left"/>
+      <w:pPr>
+        <w:tabs>
+          <w:tab w:val="num" w:pos="2160"/>
+        </w:tabs>
+        <w:ind w:left="2160" w:hanging="360"/>
+      </w:pPr>
+      <w:rPr>
+        <w:rFonts w:ascii="Wingdings" w:hAnsi="Wingdings" w:hint="default"/>
+        <w:sz w:val="20"/>
+      </w:rPr>
+    </w:lvl>
+    <w:lvl w:ilvl="3" w:tentative="1">
+      <w:start w:val="1"/>
+      <w:numFmt w:val="bullet"/>
+      <w:lvlText w:val=""/>
+      <w:lvlJc w:val="left"/>
+      <w:pPr>
+        <w:tabs>
+          <w:tab w:val="num" w:pos="2880"/>
+        </w:tabs>
+        <w:ind w:left="2880" w:hanging="360"/>
+      </w:pPr>
+      <w:rPr>
+        <w:rFonts w:ascii="Wingdings" w:hAnsi="Wingdings" w:hint="default"/>
+        <w:sz w:val="20"/>
+      </w:rPr>
+    </w:lvl>
+    <w:lvl w:ilvl="4" w:tentative="1">
+      <w:start w:val="1"/>
+      <w:numFmt w:val="bullet"/>
+      <w:lvlText w:val=""/>
+      <w:lvlJc w:val="left"/>
+      <w:pPr>
+        <w:tabs>
+          <w:tab w:val="num" w:pos="3600"/>
+        </w:tabs>
+        <w:ind w:left="3600" w:hanging="360"/>
+      </w:pPr>
+      <w:rPr>
+        <w:rFonts w:ascii="Wingdings" w:hAnsi="Wingdings" w:hint="default"/>
+        <w:sz w:val="20"/>
+      </w:rPr>
+    </w:lvl>
+    <w:lvl w:ilvl="5" w:tentative="1">
+      <w:start w:val="1"/>
+      <w:numFmt w:val="bullet"/>
+      <w:lvlText w:val=""/>
+      <w:lvlJc w:val="left"/>
+      <w:pPr>
+        <w:tabs>
+          <w:tab w:val="num" w:pos="4320"/>
+        </w:tabs>
+        <w:ind w:left="4320" w:hanging="360"/>
+      </w:pPr>
+      <w:rPr>
+        <w:rFonts w:ascii="Wingdings" w:hAnsi="Wingdings" w:hint="default"/>
+        <w:sz w:val="20"/>
+      </w:rPr>
+    </w:lvl>
+    <w:lvl w:ilvl="6" w:tentative="1">
+      <w:start w:val="1"/>
+      <w:numFmt w:val="bullet"/>
+      <w:lvlText w:val=""/>
+      <w:lvlJc w:val="left"/>
+      <w:pPr>
+        <w:tabs>
+          <w:tab w:val="num" w:pos="5040"/>
+        </w:tabs>
+        <w:ind w:left="5040" w:hanging="360"/>
+      </w:pPr>
+      <w:rPr>
+        <w:rFonts w:ascii="Wingdings" w:hAnsi="Wingdings" w:hint="default"/>
+        <w:sz w:val="20"/>
+      </w:rPr>
+    </w:lvl>
+    <w:lvl w:ilvl="7" w:tentative="1">
+      <w:start w:val="1"/>
+      <w:numFmt w:val="bullet"/>
+      <w:lvlText w:val=""/>
+      <w:lvlJc w:val="left"/>
+      <w:pPr>
+        <w:tabs>
+          <w:tab w:val="num" w:pos="5760"/>
+        </w:tabs>
+        <w:ind w:left="5760" w:hanging="360"/>
+      </w:pPr>
+      <w:rPr>
+        <w:rFonts w:ascii="Wingdings" w:hAnsi="Wingdings" w:hint="default"/>
+        <w:sz w:val="20"/>
+      </w:rPr>
+    </w:lvl>
+    <w:lvl w:ilvl="8" w:tentative="1">
+      <w:start w:val="1"/>
+      <w:numFmt w:val="bullet"/>
+      <w:lvlText w:val=""/>
+      <w:lvlJc w:val="left"/>
+      <w:pPr>
+        <w:tabs>
+          <w:tab w:val="num" w:pos="6480"/>
+        </w:tabs>
+        <w:ind w:left="6480" w:hanging="360"/>
+      </w:pPr>
+      <w:rPr>
+        <w:rFonts w:ascii="Wingdings" w:hAnsi="Wingdings" w:hint="default"/>
+        <w:sz w:val="20"/>
+      </w:rPr>
+    </w:lvl>
+  </w:abstractNum>
+  <w:abstractNum w:abstractNumId="10" w15:restartNumberingAfterBreak="0">
     <w:nsid w:val="12503914"/>
     <w:multiLevelType w:val="multilevel"/>
     <w:tmpl w:val="CD9C60AC"/>
@@ -23410,7 +24933,7 @@
       </w:pPr>
     </w:lvl>
   </w:abstractNum>
-  <w:abstractNum w:abstractNumId="10" w15:restartNumberingAfterBreak="0">
+  <w:abstractNum w:abstractNumId="11" w15:restartNumberingAfterBreak="0">
     <w:nsid w:val="12B5559E"/>
     <w:multiLevelType w:val="multilevel"/>
     <w:tmpl w:val="B2D88CDE"/>
@@ -23559,7 +25082,7 @@
       </w:rPr>
     </w:lvl>
   </w:abstractNum>
-  <w:abstractNum w:abstractNumId="11" w15:restartNumberingAfterBreak="0">
+  <w:abstractNum w:abstractNumId="12" w15:restartNumberingAfterBreak="0">
     <w:nsid w:val="13705EB4"/>
     <w:multiLevelType w:val="multilevel"/>
     <w:tmpl w:val="EE48DB80"/>
@@ -23672,7 +25195,7 @@
       </w:pPr>
     </w:lvl>
   </w:abstractNum>
-  <w:abstractNum w:abstractNumId="12" w15:restartNumberingAfterBreak="0">
+  <w:abstractNum w:abstractNumId="13" w15:restartNumberingAfterBreak="0">
     <w:nsid w:val="15A3400C"/>
     <w:multiLevelType w:val="multilevel"/>
     <w:tmpl w:val="C06ED5F8"/>
@@ -23785,7 +25308,7 @@
       </w:pPr>
     </w:lvl>
   </w:abstractNum>
-  <w:abstractNum w:abstractNumId="13" w15:restartNumberingAfterBreak="0">
+  <w:abstractNum w:abstractNumId="14" w15:restartNumberingAfterBreak="0">
     <w:nsid w:val="18146BAF"/>
     <w:multiLevelType w:val="multilevel"/>
     <w:tmpl w:val="C1E05486"/>
@@ -23934,7 +25457,297 @@
       </w:rPr>
     </w:lvl>
   </w:abstractNum>
-  <w:abstractNum w:abstractNumId="14" w15:restartNumberingAfterBreak="0">
+  <w:abstractNum w:abstractNumId="15" w15:restartNumberingAfterBreak="0">
+    <w:nsid w:val="1A402D45"/>
+    <w:multiLevelType w:val="multilevel"/>
+    <w:tmpl w:val="E586F422"/>
+    <w:lvl w:ilvl="0">
+      <w:start w:val="1"/>
+      <w:numFmt w:val="bullet"/>
+      <w:lvlText w:val=""/>
+      <w:lvlJc w:val="left"/>
+      <w:pPr>
+        <w:tabs>
+          <w:tab w:val="num" w:pos="720"/>
+        </w:tabs>
+        <w:ind w:left="720" w:hanging="360"/>
+      </w:pPr>
+      <w:rPr>
+        <w:rFonts w:ascii="Symbol" w:hAnsi="Symbol" w:hint="default"/>
+        <w:sz w:val="20"/>
+      </w:rPr>
+    </w:lvl>
+    <w:lvl w:ilvl="1" w:tentative="1">
+      <w:start w:val="1"/>
+      <w:numFmt w:val="bullet"/>
+      <w:lvlText w:val="o"/>
+      <w:lvlJc w:val="left"/>
+      <w:pPr>
+        <w:tabs>
+          <w:tab w:val="num" w:pos="1440"/>
+        </w:tabs>
+        <w:ind w:left="1440" w:hanging="360"/>
+      </w:pPr>
+      <w:rPr>
+        <w:rFonts w:ascii="Courier New" w:hAnsi="Courier New" w:hint="default"/>
+        <w:sz w:val="20"/>
+      </w:rPr>
+    </w:lvl>
+    <w:lvl w:ilvl="2" w:tentative="1">
+      <w:start w:val="1"/>
+      <w:numFmt w:val="bullet"/>
+      <w:lvlText w:val=""/>
+      <w:lvlJc w:val="left"/>
+      <w:pPr>
+        <w:tabs>
+          <w:tab w:val="num" w:pos="2160"/>
+        </w:tabs>
+        <w:ind w:left="2160" w:hanging="360"/>
+      </w:pPr>
+      <w:rPr>
+        <w:rFonts w:ascii="Wingdings" w:hAnsi="Wingdings" w:hint="default"/>
+        <w:sz w:val="20"/>
+      </w:rPr>
+    </w:lvl>
+    <w:lvl w:ilvl="3" w:tentative="1">
+      <w:start w:val="1"/>
+      <w:numFmt w:val="bullet"/>
+      <w:lvlText w:val=""/>
+      <w:lvlJc w:val="left"/>
+      <w:pPr>
+        <w:tabs>
+          <w:tab w:val="num" w:pos="2880"/>
+        </w:tabs>
+        <w:ind w:left="2880" w:hanging="360"/>
+      </w:pPr>
+      <w:rPr>
+        <w:rFonts w:ascii="Wingdings" w:hAnsi="Wingdings" w:hint="default"/>
+        <w:sz w:val="20"/>
+      </w:rPr>
+    </w:lvl>
+    <w:lvl w:ilvl="4" w:tentative="1">
+      <w:start w:val="1"/>
+      <w:numFmt w:val="bullet"/>
+      <w:lvlText w:val=""/>
+      <w:lvlJc w:val="left"/>
+      <w:pPr>
+        <w:tabs>
+          <w:tab w:val="num" w:pos="3600"/>
+        </w:tabs>
+        <w:ind w:left="3600" w:hanging="360"/>
+      </w:pPr>
+      <w:rPr>
+        <w:rFonts w:ascii="Wingdings" w:hAnsi="Wingdings" w:hint="default"/>
+        <w:sz w:val="20"/>
+      </w:rPr>
+    </w:lvl>
+    <w:lvl w:ilvl="5" w:tentative="1">
+      <w:start w:val="1"/>
+      <w:numFmt w:val="bullet"/>
+      <w:lvlText w:val=""/>
+      <w:lvlJc w:val="left"/>
+      <w:pPr>
+        <w:tabs>
+          <w:tab w:val="num" w:pos="4320"/>
+        </w:tabs>
+        <w:ind w:left="4320" w:hanging="360"/>
+      </w:pPr>
+      <w:rPr>
+        <w:rFonts w:ascii="Wingdings" w:hAnsi="Wingdings" w:hint="default"/>
+        <w:sz w:val="20"/>
+      </w:rPr>
+    </w:lvl>
+    <w:lvl w:ilvl="6" w:tentative="1">
+      <w:start w:val="1"/>
+      <w:numFmt w:val="bullet"/>
+      <w:lvlText w:val=""/>
+      <w:lvlJc w:val="left"/>
+      <w:pPr>
+        <w:tabs>
+          <w:tab w:val="num" w:pos="5040"/>
+        </w:tabs>
+        <w:ind w:left="5040" w:hanging="360"/>
+      </w:pPr>
+      <w:rPr>
+        <w:rFonts w:ascii="Wingdings" w:hAnsi="Wingdings" w:hint="default"/>
+        <w:sz w:val="20"/>
+      </w:rPr>
+    </w:lvl>
+    <w:lvl w:ilvl="7" w:tentative="1">
+      <w:start w:val="1"/>
+      <w:numFmt w:val="bullet"/>
+      <w:lvlText w:val=""/>
+      <w:lvlJc w:val="left"/>
+      <w:pPr>
+        <w:tabs>
+          <w:tab w:val="num" w:pos="5760"/>
+        </w:tabs>
+        <w:ind w:left="5760" w:hanging="360"/>
+      </w:pPr>
+      <w:rPr>
+        <w:rFonts w:ascii="Wingdings" w:hAnsi="Wingdings" w:hint="default"/>
+        <w:sz w:val="20"/>
+      </w:rPr>
+    </w:lvl>
+    <w:lvl w:ilvl="8" w:tentative="1">
+      <w:start w:val="1"/>
+      <w:numFmt w:val="bullet"/>
+      <w:lvlText w:val=""/>
+      <w:lvlJc w:val="left"/>
+      <w:pPr>
+        <w:tabs>
+          <w:tab w:val="num" w:pos="6480"/>
+        </w:tabs>
+        <w:ind w:left="6480" w:hanging="360"/>
+      </w:pPr>
+      <w:rPr>
+        <w:rFonts w:ascii="Wingdings" w:hAnsi="Wingdings" w:hint="default"/>
+        <w:sz w:val="20"/>
+      </w:rPr>
+    </w:lvl>
+  </w:abstractNum>
+  <w:abstractNum w:abstractNumId="16" w15:restartNumberingAfterBreak="0">
+    <w:nsid w:val="1BA25E4F"/>
+    <w:multiLevelType w:val="hybridMultilevel"/>
+    <w:tmpl w:val="B24A2CC4"/>
+    <w:lvl w:ilvl="0" w:tplc="E8C8F4D0">
+      <w:start w:val="1"/>
+      <w:numFmt w:val="bullet"/>
+      <w:lvlText w:val=""/>
+      <w:lvlPicBulletId w:val="0"/>
+      <w:lvlJc w:val="left"/>
+      <w:pPr>
+        <w:tabs>
+          <w:tab w:val="num" w:pos="720"/>
+        </w:tabs>
+        <w:ind w:left="720" w:hanging="360"/>
+      </w:pPr>
+      <w:rPr>
+        <w:rFonts w:ascii="Symbol" w:hAnsi="Symbol" w:hint="default"/>
+      </w:rPr>
+    </w:lvl>
+    <w:lvl w:ilvl="1" w:tplc="60621D00" w:tentative="1">
+      <w:start w:val="1"/>
+      <w:numFmt w:val="bullet"/>
+      <w:lvlText w:val=""/>
+      <w:lvlJc w:val="left"/>
+      <w:pPr>
+        <w:tabs>
+          <w:tab w:val="num" w:pos="1440"/>
+        </w:tabs>
+        <w:ind w:left="1440" w:hanging="360"/>
+      </w:pPr>
+      <w:rPr>
+        <w:rFonts w:ascii="Symbol" w:hAnsi="Symbol" w:hint="default"/>
+      </w:rPr>
+    </w:lvl>
+    <w:lvl w:ilvl="2" w:tplc="DD268A4C" w:tentative="1">
+      <w:start w:val="1"/>
+      <w:numFmt w:val="bullet"/>
+      <w:lvlText w:val=""/>
+      <w:lvlJc w:val="left"/>
+      <w:pPr>
+        <w:tabs>
+          <w:tab w:val="num" w:pos="2160"/>
+        </w:tabs>
+        <w:ind w:left="2160" w:hanging="360"/>
+      </w:pPr>
+      <w:rPr>
+        <w:rFonts w:ascii="Symbol" w:hAnsi="Symbol" w:hint="default"/>
+      </w:rPr>
+    </w:lvl>
+    <w:lvl w:ilvl="3" w:tplc="E5D2320C" w:tentative="1">
+      <w:start w:val="1"/>
+      <w:numFmt w:val="bullet"/>
+      <w:lvlText w:val=""/>
+      <w:lvlJc w:val="left"/>
+      <w:pPr>
+        <w:tabs>
+          <w:tab w:val="num" w:pos="2880"/>
+        </w:tabs>
+        <w:ind w:left="2880" w:hanging="360"/>
+      </w:pPr>
+      <w:rPr>
+        <w:rFonts w:ascii="Symbol" w:hAnsi="Symbol" w:hint="default"/>
+      </w:rPr>
+    </w:lvl>
+    <w:lvl w:ilvl="4" w:tplc="4A46F83C" w:tentative="1">
+      <w:start w:val="1"/>
+      <w:numFmt w:val="bullet"/>
+      <w:lvlText w:val=""/>
+      <w:lvlJc w:val="left"/>
+      <w:pPr>
+        <w:tabs>
+          <w:tab w:val="num" w:pos="3600"/>
+        </w:tabs>
+        <w:ind w:left="3600" w:hanging="360"/>
+      </w:pPr>
+      <w:rPr>
+        <w:rFonts w:ascii="Symbol" w:hAnsi="Symbol" w:hint="default"/>
+      </w:rPr>
+    </w:lvl>
+    <w:lvl w:ilvl="5" w:tplc="BE88E52C" w:tentative="1">
+      <w:start w:val="1"/>
+      <w:numFmt w:val="bullet"/>
+      <w:lvlText w:val=""/>
+      <w:lvlJc w:val="left"/>
+      <w:pPr>
+        <w:tabs>
+          <w:tab w:val="num" w:pos="4320"/>
+        </w:tabs>
+        <w:ind w:left="4320" w:hanging="360"/>
+      </w:pPr>
+      <w:rPr>
+        <w:rFonts w:ascii="Symbol" w:hAnsi="Symbol" w:hint="default"/>
+      </w:rPr>
+    </w:lvl>
+    <w:lvl w:ilvl="6" w:tplc="832A588A" w:tentative="1">
+      <w:start w:val="1"/>
+      <w:numFmt w:val="bullet"/>
+      <w:lvlText w:val=""/>
+      <w:lvlJc w:val="left"/>
+      <w:pPr>
+        <w:tabs>
+          <w:tab w:val="num" w:pos="5040"/>
+        </w:tabs>
+        <w:ind w:left="5040" w:hanging="360"/>
+      </w:pPr>
+      <w:rPr>
+        <w:rFonts w:ascii="Symbol" w:hAnsi="Symbol" w:hint="default"/>
+      </w:rPr>
+    </w:lvl>
+    <w:lvl w:ilvl="7" w:tplc="1EC4A69E" w:tentative="1">
+      <w:start w:val="1"/>
+      <w:numFmt w:val="bullet"/>
+      <w:lvlText w:val=""/>
+      <w:lvlJc w:val="left"/>
+      <w:pPr>
+        <w:tabs>
+          <w:tab w:val="num" w:pos="5760"/>
+        </w:tabs>
+        <w:ind w:left="5760" w:hanging="360"/>
+      </w:pPr>
+      <w:rPr>
+        <w:rFonts w:ascii="Symbol" w:hAnsi="Symbol" w:hint="default"/>
+      </w:rPr>
+    </w:lvl>
+    <w:lvl w:ilvl="8" w:tplc="8C96D14E" w:tentative="1">
+      <w:start w:val="1"/>
+      <w:numFmt w:val="bullet"/>
+      <w:lvlText w:val=""/>
+      <w:lvlJc w:val="left"/>
+      <w:pPr>
+        <w:tabs>
+          <w:tab w:val="num" w:pos="6480"/>
+        </w:tabs>
+        <w:ind w:left="6480" w:hanging="360"/>
+      </w:pPr>
+      <w:rPr>
+        <w:rFonts w:ascii="Symbol" w:hAnsi="Symbol" w:hint="default"/>
+      </w:rPr>
+    </w:lvl>
+  </w:abstractNum>
+  <w:abstractNum w:abstractNumId="17" w15:restartNumberingAfterBreak="0">
     <w:nsid w:val="1C5F246C"/>
     <w:multiLevelType w:val="multilevel"/>
     <w:tmpl w:val="082003DC"/>
@@ -24083,7 +25896,7 @@
       </w:rPr>
     </w:lvl>
   </w:abstractNum>
-  <w:abstractNum w:abstractNumId="15" w15:restartNumberingAfterBreak="0">
+  <w:abstractNum w:abstractNumId="18" w15:restartNumberingAfterBreak="0">
     <w:nsid w:val="1F4F5DAE"/>
     <w:multiLevelType w:val="multilevel"/>
     <w:tmpl w:val="2A32030C"/>
@@ -24196,7 +26009,7 @@
       </w:pPr>
     </w:lvl>
   </w:abstractNum>
-  <w:abstractNum w:abstractNumId="16" w15:restartNumberingAfterBreak="0">
+  <w:abstractNum w:abstractNumId="19" w15:restartNumberingAfterBreak="0">
     <w:nsid w:val="20F1717F"/>
     <w:multiLevelType w:val="multilevel"/>
     <w:tmpl w:val="ED4C1668"/>
@@ -24309,7 +26122,7 @@
       </w:pPr>
     </w:lvl>
   </w:abstractNum>
-  <w:abstractNum w:abstractNumId="17" w15:restartNumberingAfterBreak="0">
+  <w:abstractNum w:abstractNumId="20" w15:restartNumberingAfterBreak="0">
     <w:nsid w:val="247847B8"/>
     <w:multiLevelType w:val="multilevel"/>
     <w:tmpl w:val="518CCDF2"/>
@@ -24458,7 +26271,7 @@
       </w:rPr>
     </w:lvl>
   </w:abstractNum>
-  <w:abstractNum w:abstractNumId="18" w15:restartNumberingAfterBreak="0">
+  <w:abstractNum w:abstractNumId="21" w15:restartNumberingAfterBreak="0">
     <w:nsid w:val="275E097E"/>
     <w:multiLevelType w:val="multilevel"/>
     <w:tmpl w:val="96D01A6E"/>
@@ -24607,7 +26420,7 @@
       </w:rPr>
     </w:lvl>
   </w:abstractNum>
-  <w:abstractNum w:abstractNumId="19" w15:restartNumberingAfterBreak="0">
+  <w:abstractNum w:abstractNumId="22" w15:restartNumberingAfterBreak="0">
     <w:nsid w:val="278550D3"/>
     <w:multiLevelType w:val="multilevel"/>
     <w:tmpl w:val="DE0626A8"/>
@@ -24720,7 +26533,7 @@
       </w:pPr>
     </w:lvl>
   </w:abstractNum>
-  <w:abstractNum w:abstractNumId="20" w15:restartNumberingAfterBreak="0">
+  <w:abstractNum w:abstractNumId="23" w15:restartNumberingAfterBreak="0">
     <w:nsid w:val="2A094F50"/>
     <w:multiLevelType w:val="multilevel"/>
     <w:tmpl w:val="C83E8DDC"/>
@@ -24869,7 +26682,7 @@
       </w:rPr>
     </w:lvl>
   </w:abstractNum>
-  <w:abstractNum w:abstractNumId="21" w15:restartNumberingAfterBreak="0">
+  <w:abstractNum w:abstractNumId="24" w15:restartNumberingAfterBreak="0">
     <w:nsid w:val="2A275442"/>
     <w:multiLevelType w:val="multilevel"/>
     <w:tmpl w:val="4EFEF972"/>
@@ -25018,7 +26831,7 @@
       </w:rPr>
     </w:lvl>
   </w:abstractNum>
-  <w:abstractNum w:abstractNumId="22" w15:restartNumberingAfterBreak="0">
+  <w:abstractNum w:abstractNumId="25" w15:restartNumberingAfterBreak="0">
     <w:nsid w:val="2E1A4FF0"/>
     <w:multiLevelType w:val="multilevel"/>
     <w:tmpl w:val="C756DE06"/>
@@ -25135,7 +26948,7 @@
       </w:pPr>
     </w:lvl>
   </w:abstractNum>
-  <w:abstractNum w:abstractNumId="23" w15:restartNumberingAfterBreak="0">
+  <w:abstractNum w:abstractNumId="26" w15:restartNumberingAfterBreak="0">
     <w:nsid w:val="321C1E67"/>
     <w:multiLevelType w:val="multilevel"/>
     <w:tmpl w:val="297E4968"/>
@@ -25248,7 +27061,7 @@
       </w:pPr>
     </w:lvl>
   </w:abstractNum>
-  <w:abstractNum w:abstractNumId="24" w15:restartNumberingAfterBreak="0">
+  <w:abstractNum w:abstractNumId="27" w15:restartNumberingAfterBreak="0">
     <w:nsid w:val="36EF1F70"/>
     <w:multiLevelType w:val="multilevel"/>
     <w:tmpl w:val="8DF6894E"/>
@@ -25361,7 +27174,7 @@
       </w:pPr>
     </w:lvl>
   </w:abstractNum>
-  <w:abstractNum w:abstractNumId="25" w15:restartNumberingAfterBreak="0">
+  <w:abstractNum w:abstractNumId="28" w15:restartNumberingAfterBreak="0">
     <w:nsid w:val="38666CDD"/>
     <w:multiLevelType w:val="multilevel"/>
     <w:tmpl w:val="3ABA6FA8"/>
@@ -25510,7 +27323,7 @@
       </w:rPr>
     </w:lvl>
   </w:abstractNum>
-  <w:abstractNum w:abstractNumId="26" w15:restartNumberingAfterBreak="0">
+  <w:abstractNum w:abstractNumId="29" w15:restartNumberingAfterBreak="0">
     <w:nsid w:val="3AD953A1"/>
     <w:multiLevelType w:val="multilevel"/>
     <w:tmpl w:val="F9480A14"/>
@@ -25623,7 +27436,7 @@
       </w:pPr>
     </w:lvl>
   </w:abstractNum>
-  <w:abstractNum w:abstractNumId="27" w15:restartNumberingAfterBreak="0">
+  <w:abstractNum w:abstractNumId="30" w15:restartNumberingAfterBreak="0">
     <w:nsid w:val="3AE65789"/>
     <w:multiLevelType w:val="multilevel"/>
     <w:tmpl w:val="C302AEA0"/>
@@ -25736,7 +27549,7 @@
       </w:pPr>
     </w:lvl>
   </w:abstractNum>
-  <w:abstractNum w:abstractNumId="28" w15:restartNumberingAfterBreak="0">
+  <w:abstractNum w:abstractNumId="31" w15:restartNumberingAfterBreak="0">
     <w:nsid w:val="3E4A6551"/>
     <w:multiLevelType w:val="multilevel"/>
     <w:tmpl w:val="3E7455EE"/>
@@ -25849,7 +27662,7 @@
       </w:pPr>
     </w:lvl>
   </w:abstractNum>
-  <w:abstractNum w:abstractNumId="29" w15:restartNumberingAfterBreak="0">
+  <w:abstractNum w:abstractNumId="32" w15:restartNumberingAfterBreak="0">
     <w:nsid w:val="3ED53534"/>
     <w:multiLevelType w:val="multilevel"/>
     <w:tmpl w:val="98300930"/>
@@ -25962,7 +27775,7 @@
       </w:pPr>
     </w:lvl>
   </w:abstractNum>
-  <w:abstractNum w:abstractNumId="30" w15:restartNumberingAfterBreak="0">
+  <w:abstractNum w:abstractNumId="33" w15:restartNumberingAfterBreak="0">
     <w:nsid w:val="404A1288"/>
     <w:multiLevelType w:val="multilevel"/>
     <w:tmpl w:val="306E5C36"/>
@@ -26075,7 +27888,7 @@
       </w:pPr>
     </w:lvl>
   </w:abstractNum>
-  <w:abstractNum w:abstractNumId="31" w15:restartNumberingAfterBreak="0">
+  <w:abstractNum w:abstractNumId="34" w15:restartNumberingAfterBreak="0">
     <w:nsid w:val="41B3427D"/>
     <w:multiLevelType w:val="multilevel"/>
     <w:tmpl w:val="0F5A7348"/>
@@ -26224,7 +28037,156 @@
       </w:rPr>
     </w:lvl>
   </w:abstractNum>
-  <w:abstractNum w:abstractNumId="32" w15:restartNumberingAfterBreak="0">
+  <w:abstractNum w:abstractNumId="35" w15:restartNumberingAfterBreak="0">
+    <w:nsid w:val="42F27139"/>
+    <w:multiLevelType w:val="multilevel"/>
+    <w:tmpl w:val="D624A7AE"/>
+    <w:lvl w:ilvl="0">
+      <w:start w:val="1"/>
+      <w:numFmt w:val="bullet"/>
+      <w:lvlText w:val=""/>
+      <w:lvlJc w:val="left"/>
+      <w:pPr>
+        <w:tabs>
+          <w:tab w:val="num" w:pos="720"/>
+        </w:tabs>
+        <w:ind w:left="720" w:hanging="360"/>
+      </w:pPr>
+      <w:rPr>
+        <w:rFonts w:ascii="Symbol" w:hAnsi="Symbol" w:hint="default"/>
+        <w:sz w:val="20"/>
+      </w:rPr>
+    </w:lvl>
+    <w:lvl w:ilvl="1" w:tentative="1">
+      <w:start w:val="1"/>
+      <w:numFmt w:val="bullet"/>
+      <w:lvlText w:val="o"/>
+      <w:lvlJc w:val="left"/>
+      <w:pPr>
+        <w:tabs>
+          <w:tab w:val="num" w:pos="1440"/>
+        </w:tabs>
+        <w:ind w:left="1440" w:hanging="360"/>
+      </w:pPr>
+      <w:rPr>
+        <w:rFonts w:ascii="Courier New" w:hAnsi="Courier New" w:hint="default"/>
+        <w:sz w:val="20"/>
+      </w:rPr>
+    </w:lvl>
+    <w:lvl w:ilvl="2" w:tentative="1">
+      <w:start w:val="1"/>
+      <w:numFmt w:val="bullet"/>
+      <w:lvlText w:val=""/>
+      <w:lvlJc w:val="left"/>
+      <w:pPr>
+        <w:tabs>
+          <w:tab w:val="num" w:pos="2160"/>
+        </w:tabs>
+        <w:ind w:left="2160" w:hanging="360"/>
+      </w:pPr>
+      <w:rPr>
+        <w:rFonts w:ascii="Wingdings" w:hAnsi="Wingdings" w:hint="default"/>
+        <w:sz w:val="20"/>
+      </w:rPr>
+    </w:lvl>
+    <w:lvl w:ilvl="3" w:tentative="1">
+      <w:start w:val="1"/>
+      <w:numFmt w:val="bullet"/>
+      <w:lvlText w:val=""/>
+      <w:lvlJc w:val="left"/>
+      <w:pPr>
+        <w:tabs>
+          <w:tab w:val="num" w:pos="2880"/>
+        </w:tabs>
+        <w:ind w:left="2880" w:hanging="360"/>
+      </w:pPr>
+      <w:rPr>
+        <w:rFonts w:ascii="Wingdings" w:hAnsi="Wingdings" w:hint="default"/>
+        <w:sz w:val="20"/>
+      </w:rPr>
+    </w:lvl>
+    <w:lvl w:ilvl="4" w:tentative="1">
+      <w:start w:val="1"/>
+      <w:numFmt w:val="bullet"/>
+      <w:lvlText w:val=""/>
+      <w:lvlJc w:val="left"/>
+      <w:pPr>
+        <w:tabs>
+          <w:tab w:val="num" w:pos="3600"/>
+        </w:tabs>
+        <w:ind w:left="3600" w:hanging="360"/>
+      </w:pPr>
+      <w:rPr>
+        <w:rFonts w:ascii="Wingdings" w:hAnsi="Wingdings" w:hint="default"/>
+        <w:sz w:val="20"/>
+      </w:rPr>
+    </w:lvl>
+    <w:lvl w:ilvl="5" w:tentative="1">
+      <w:start w:val="1"/>
+      <w:numFmt w:val="bullet"/>
+      <w:lvlText w:val=""/>
+      <w:lvlJc w:val="left"/>
+      <w:pPr>
+        <w:tabs>
+          <w:tab w:val="num" w:pos="4320"/>
+        </w:tabs>
+        <w:ind w:left="4320" w:hanging="360"/>
+      </w:pPr>
+      <w:rPr>
+        <w:rFonts w:ascii="Wingdings" w:hAnsi="Wingdings" w:hint="default"/>
+        <w:sz w:val="20"/>
+      </w:rPr>
+    </w:lvl>
+    <w:lvl w:ilvl="6" w:tentative="1">
+      <w:start w:val="1"/>
+      <w:numFmt w:val="bullet"/>
+      <w:lvlText w:val=""/>
+      <w:lvlJc w:val="left"/>
+      <w:pPr>
+        <w:tabs>
+          <w:tab w:val="num" w:pos="5040"/>
+        </w:tabs>
+        <w:ind w:left="5040" w:hanging="360"/>
+      </w:pPr>
+      <w:rPr>
+        <w:rFonts w:ascii="Wingdings" w:hAnsi="Wingdings" w:hint="default"/>
+        <w:sz w:val="20"/>
+      </w:rPr>
+    </w:lvl>
+    <w:lvl w:ilvl="7" w:tentative="1">
+      <w:start w:val="1"/>
+      <w:numFmt w:val="bullet"/>
+      <w:lvlText w:val=""/>
+      <w:lvlJc w:val="left"/>
+      <w:pPr>
+        <w:tabs>
+          <w:tab w:val="num" w:pos="5760"/>
+        </w:tabs>
+        <w:ind w:left="5760" w:hanging="360"/>
+      </w:pPr>
+      <w:rPr>
+        <w:rFonts w:ascii="Wingdings" w:hAnsi="Wingdings" w:hint="default"/>
+        <w:sz w:val="20"/>
+      </w:rPr>
+    </w:lvl>
+    <w:lvl w:ilvl="8" w:tentative="1">
+      <w:start w:val="1"/>
+      <w:numFmt w:val="bullet"/>
+      <w:lvlText w:val=""/>
+      <w:lvlJc w:val="left"/>
+      <w:pPr>
+        <w:tabs>
+          <w:tab w:val="num" w:pos="6480"/>
+        </w:tabs>
+        <w:ind w:left="6480" w:hanging="360"/>
+      </w:pPr>
+      <w:rPr>
+        <w:rFonts w:ascii="Wingdings" w:hAnsi="Wingdings" w:hint="default"/>
+        <w:sz w:val="20"/>
+      </w:rPr>
+    </w:lvl>
+  </w:abstractNum>
+  <w:abstractNum w:abstractNumId="36" w15:restartNumberingAfterBreak="0">
     <w:nsid w:val="454E00BC"/>
     <w:multiLevelType w:val="multilevel"/>
     <w:tmpl w:val="C242E5E2"/>
@@ -26373,7 +28335,7 @@
       </w:rPr>
     </w:lvl>
   </w:abstractNum>
-  <w:abstractNum w:abstractNumId="33" w15:restartNumberingAfterBreak="0">
+  <w:abstractNum w:abstractNumId="37" w15:restartNumberingAfterBreak="0">
     <w:nsid w:val="48CA2733"/>
     <w:multiLevelType w:val="multilevel"/>
     <w:tmpl w:val="FFD2C896"/>
@@ -26486,7 +28448,7 @@
       </w:pPr>
     </w:lvl>
   </w:abstractNum>
-  <w:abstractNum w:abstractNumId="34" w15:restartNumberingAfterBreak="0">
+  <w:abstractNum w:abstractNumId="38" w15:restartNumberingAfterBreak="0">
     <w:nsid w:val="499C361C"/>
     <w:multiLevelType w:val="multilevel"/>
     <w:tmpl w:val="0F0CB1CC"/>
@@ -26599,7 +28561,7 @@
       </w:pPr>
     </w:lvl>
   </w:abstractNum>
-  <w:abstractNum w:abstractNumId="35" w15:restartNumberingAfterBreak="0">
+  <w:abstractNum w:abstractNumId="39" w15:restartNumberingAfterBreak="0">
     <w:nsid w:val="4A991665"/>
     <w:multiLevelType w:val="multilevel"/>
     <w:tmpl w:val="B1CC600C"/>
@@ -26712,7 +28674,7 @@
       </w:pPr>
     </w:lvl>
   </w:abstractNum>
-  <w:abstractNum w:abstractNumId="36" w15:restartNumberingAfterBreak="0">
+  <w:abstractNum w:abstractNumId="40" w15:restartNumberingAfterBreak="0">
     <w:nsid w:val="4D8A5E51"/>
     <w:multiLevelType w:val="multilevel"/>
     <w:tmpl w:val="15248B3E"/>
@@ -26861,7 +28823,7 @@
       </w:rPr>
     </w:lvl>
   </w:abstractNum>
-  <w:abstractNum w:abstractNumId="37" w15:restartNumberingAfterBreak="0">
+  <w:abstractNum w:abstractNumId="41" w15:restartNumberingAfterBreak="0">
     <w:nsid w:val="51D343FD"/>
     <w:multiLevelType w:val="multilevel"/>
     <w:tmpl w:val="130CFEA2"/>
@@ -27010,7 +28972,7 @@
       </w:rPr>
     </w:lvl>
   </w:abstractNum>
-  <w:abstractNum w:abstractNumId="38" w15:restartNumberingAfterBreak="0">
+  <w:abstractNum w:abstractNumId="42" w15:restartNumberingAfterBreak="0">
     <w:nsid w:val="5207287F"/>
     <w:multiLevelType w:val="multilevel"/>
     <w:tmpl w:val="7D36169C"/>
@@ -27127,7 +29089,7 @@
       </w:pPr>
     </w:lvl>
   </w:abstractNum>
-  <w:abstractNum w:abstractNumId="39" w15:restartNumberingAfterBreak="0">
+  <w:abstractNum w:abstractNumId="43" w15:restartNumberingAfterBreak="0">
     <w:nsid w:val="53E666E2"/>
     <w:multiLevelType w:val="multilevel"/>
     <w:tmpl w:val="69A2D578"/>
@@ -27240,7 +29202,7 @@
       </w:pPr>
     </w:lvl>
   </w:abstractNum>
-  <w:abstractNum w:abstractNumId="40" w15:restartNumberingAfterBreak="0">
+  <w:abstractNum w:abstractNumId="44" w15:restartNumberingAfterBreak="0">
     <w:nsid w:val="5469076B"/>
     <w:multiLevelType w:val="multilevel"/>
     <w:tmpl w:val="8216F9CE"/>
@@ -27353,7 +29315,7 @@
       </w:pPr>
     </w:lvl>
   </w:abstractNum>
-  <w:abstractNum w:abstractNumId="41" w15:restartNumberingAfterBreak="0">
+  <w:abstractNum w:abstractNumId="45" w15:restartNumberingAfterBreak="0">
     <w:nsid w:val="557407C5"/>
     <w:multiLevelType w:val="multilevel"/>
     <w:tmpl w:val="72301F34"/>
@@ -27466,7 +29428,7 @@
       </w:pPr>
     </w:lvl>
   </w:abstractNum>
-  <w:abstractNum w:abstractNumId="42" w15:restartNumberingAfterBreak="0">
+  <w:abstractNum w:abstractNumId="46" w15:restartNumberingAfterBreak="0">
     <w:nsid w:val="57D716E0"/>
     <w:multiLevelType w:val="multilevel"/>
     <w:tmpl w:val="6CFA3916"/>
@@ -27579,7 +29541,7 @@
       </w:pPr>
     </w:lvl>
   </w:abstractNum>
-  <w:abstractNum w:abstractNumId="43" w15:restartNumberingAfterBreak="0">
+  <w:abstractNum w:abstractNumId="47" w15:restartNumberingAfterBreak="0">
     <w:nsid w:val="57D96AFD"/>
     <w:multiLevelType w:val="multilevel"/>
     <w:tmpl w:val="56DEDC62"/>
@@ -27692,7 +29654,156 @@
       </w:pPr>
     </w:lvl>
   </w:abstractNum>
-  <w:abstractNum w:abstractNumId="44" w15:restartNumberingAfterBreak="0">
+  <w:abstractNum w:abstractNumId="48" w15:restartNumberingAfterBreak="0">
+    <w:nsid w:val="5DCE655E"/>
+    <w:multiLevelType w:val="multilevel"/>
+    <w:tmpl w:val="32207172"/>
+    <w:lvl w:ilvl="0">
+      <w:start w:val="1"/>
+      <w:numFmt w:val="bullet"/>
+      <w:lvlText w:val=""/>
+      <w:lvlJc w:val="left"/>
+      <w:pPr>
+        <w:tabs>
+          <w:tab w:val="num" w:pos="720"/>
+        </w:tabs>
+        <w:ind w:left="720" w:hanging="360"/>
+      </w:pPr>
+      <w:rPr>
+        <w:rFonts w:ascii="Symbol" w:hAnsi="Symbol" w:hint="default"/>
+        <w:sz w:val="20"/>
+      </w:rPr>
+    </w:lvl>
+    <w:lvl w:ilvl="1" w:tentative="1">
+      <w:start w:val="1"/>
+      <w:numFmt w:val="bullet"/>
+      <w:lvlText w:val="o"/>
+      <w:lvlJc w:val="left"/>
+      <w:pPr>
+        <w:tabs>
+          <w:tab w:val="num" w:pos="1440"/>
+        </w:tabs>
+        <w:ind w:left="1440" w:hanging="360"/>
+      </w:pPr>
+      <w:rPr>
+        <w:rFonts w:ascii="Courier New" w:hAnsi="Courier New" w:hint="default"/>
+        <w:sz w:val="20"/>
+      </w:rPr>
+    </w:lvl>
+    <w:lvl w:ilvl="2" w:tentative="1">
+      <w:start w:val="1"/>
+      <w:numFmt w:val="bullet"/>
+      <w:lvlText w:val=""/>
+      <w:lvlJc w:val="left"/>
+      <w:pPr>
+        <w:tabs>
+          <w:tab w:val="num" w:pos="2160"/>
+        </w:tabs>
+        <w:ind w:left="2160" w:hanging="360"/>
+      </w:pPr>
+      <w:rPr>
+        <w:rFonts w:ascii="Wingdings" w:hAnsi="Wingdings" w:hint="default"/>
+        <w:sz w:val="20"/>
+      </w:rPr>
+    </w:lvl>
+    <w:lvl w:ilvl="3" w:tentative="1">
+      <w:start w:val="1"/>
+      <w:numFmt w:val="bullet"/>
+      <w:lvlText w:val=""/>
+      <w:lvlJc w:val="left"/>
+      <w:pPr>
+        <w:tabs>
+          <w:tab w:val="num" w:pos="2880"/>
+        </w:tabs>
+        <w:ind w:left="2880" w:hanging="360"/>
+      </w:pPr>
+      <w:rPr>
+        <w:rFonts w:ascii="Wingdings" w:hAnsi="Wingdings" w:hint="default"/>
+        <w:sz w:val="20"/>
+      </w:rPr>
+    </w:lvl>
+    <w:lvl w:ilvl="4" w:tentative="1">
+      <w:start w:val="1"/>
+      <w:numFmt w:val="bullet"/>
+      <w:lvlText w:val=""/>
+      <w:lvlJc w:val="left"/>
+      <w:pPr>
+        <w:tabs>
+          <w:tab w:val="num" w:pos="3600"/>
+        </w:tabs>
+        <w:ind w:left="3600" w:hanging="360"/>
+      </w:pPr>
+      <w:rPr>
+        <w:rFonts w:ascii="Wingdings" w:hAnsi="Wingdings" w:hint="default"/>
+        <w:sz w:val="20"/>
+      </w:rPr>
+    </w:lvl>
+    <w:lvl w:ilvl="5" w:tentative="1">
+      <w:start w:val="1"/>
+      <w:numFmt w:val="bullet"/>
+      <w:lvlText w:val=""/>
+      <w:lvlJc w:val="left"/>
+      <w:pPr>
+        <w:tabs>
+          <w:tab w:val="num" w:pos="4320"/>
+        </w:tabs>
+        <w:ind w:left="4320" w:hanging="360"/>
+      </w:pPr>
+      <w:rPr>
+        <w:rFonts w:ascii="Wingdings" w:hAnsi="Wingdings" w:hint="default"/>
+        <w:sz w:val="20"/>
+      </w:rPr>
+    </w:lvl>
+    <w:lvl w:ilvl="6" w:tentative="1">
+      <w:start w:val="1"/>
+      <w:numFmt w:val="bullet"/>
+      <w:lvlText w:val=""/>
+      <w:lvlJc w:val="left"/>
+      <w:pPr>
+        <w:tabs>
+          <w:tab w:val="num" w:pos="5040"/>
+        </w:tabs>
+        <w:ind w:left="5040" w:hanging="360"/>
+      </w:pPr>
+      <w:rPr>
+        <w:rFonts w:ascii="Wingdings" w:hAnsi="Wingdings" w:hint="default"/>
+        <w:sz w:val="20"/>
+      </w:rPr>
+    </w:lvl>
+    <w:lvl w:ilvl="7" w:tentative="1">
+      <w:start w:val="1"/>
+      <w:numFmt w:val="bullet"/>
+      <w:lvlText w:val=""/>
+      <w:lvlJc w:val="left"/>
+      <w:pPr>
+        <w:tabs>
+          <w:tab w:val="num" w:pos="5760"/>
+        </w:tabs>
+        <w:ind w:left="5760" w:hanging="360"/>
+      </w:pPr>
+      <w:rPr>
+        <w:rFonts w:ascii="Wingdings" w:hAnsi="Wingdings" w:hint="default"/>
+        <w:sz w:val="20"/>
+      </w:rPr>
+    </w:lvl>
+    <w:lvl w:ilvl="8" w:tentative="1">
+      <w:start w:val="1"/>
+      <w:numFmt w:val="bullet"/>
+      <w:lvlText w:val=""/>
+      <w:lvlJc w:val="left"/>
+      <w:pPr>
+        <w:tabs>
+          <w:tab w:val="num" w:pos="6480"/>
+        </w:tabs>
+        <w:ind w:left="6480" w:hanging="360"/>
+      </w:pPr>
+      <w:rPr>
+        <w:rFonts w:ascii="Wingdings" w:hAnsi="Wingdings" w:hint="default"/>
+        <w:sz w:val="20"/>
+      </w:rPr>
+    </w:lvl>
+  </w:abstractNum>
+  <w:abstractNum w:abstractNumId="49" w15:restartNumberingAfterBreak="0">
     <w:nsid w:val="5E6333E1"/>
     <w:multiLevelType w:val="multilevel"/>
     <w:tmpl w:val="DF66D846"/>
@@ -27809,7 +29920,7 @@
       </w:pPr>
     </w:lvl>
   </w:abstractNum>
-  <w:abstractNum w:abstractNumId="45" w15:restartNumberingAfterBreak="0">
+  <w:abstractNum w:abstractNumId="50" w15:restartNumberingAfterBreak="0">
     <w:nsid w:val="61605BF5"/>
     <w:multiLevelType w:val="multilevel"/>
     <w:tmpl w:val="3356CA7C"/>
@@ -27922,7 +30033,7 @@
       </w:pPr>
     </w:lvl>
   </w:abstractNum>
-  <w:abstractNum w:abstractNumId="46" w15:restartNumberingAfterBreak="0">
+  <w:abstractNum w:abstractNumId="51" w15:restartNumberingAfterBreak="0">
     <w:nsid w:val="61C63295"/>
     <w:multiLevelType w:val="multilevel"/>
     <w:tmpl w:val="8AFA2E72"/>
@@ -28071,7 +30182,7 @@
       </w:rPr>
     </w:lvl>
   </w:abstractNum>
-  <w:abstractNum w:abstractNumId="47" w15:restartNumberingAfterBreak="0">
+  <w:abstractNum w:abstractNumId="52" w15:restartNumberingAfterBreak="0">
     <w:nsid w:val="61F37DFF"/>
     <w:multiLevelType w:val="multilevel"/>
     <w:tmpl w:val="D3948106"/>
@@ -28184,7 +30295,7 @@
       </w:pPr>
     </w:lvl>
   </w:abstractNum>
-  <w:abstractNum w:abstractNumId="48" w15:restartNumberingAfterBreak="0">
+  <w:abstractNum w:abstractNumId="53" w15:restartNumberingAfterBreak="0">
     <w:nsid w:val="677132AC"/>
     <w:multiLevelType w:val="multilevel"/>
     <w:tmpl w:val="7414B03C"/>
@@ -28301,7 +30412,7 @@
       </w:pPr>
     </w:lvl>
   </w:abstractNum>
-  <w:abstractNum w:abstractNumId="49" w15:restartNumberingAfterBreak="0">
+  <w:abstractNum w:abstractNumId="54" w15:restartNumberingAfterBreak="0">
     <w:nsid w:val="689A25E9"/>
     <w:multiLevelType w:val="multilevel"/>
     <w:tmpl w:val="3938A6F2"/>
@@ -28450,7 +30561,156 @@
       </w:rPr>
     </w:lvl>
   </w:abstractNum>
-  <w:abstractNum w:abstractNumId="50" w15:restartNumberingAfterBreak="0">
+  <w:abstractNum w:abstractNumId="55" w15:restartNumberingAfterBreak="0">
+    <w:nsid w:val="6AEF14F7"/>
+    <w:multiLevelType w:val="multilevel"/>
+    <w:tmpl w:val="176A98F2"/>
+    <w:lvl w:ilvl="0">
+      <w:start w:val="1"/>
+      <w:numFmt w:val="bullet"/>
+      <w:lvlText w:val=""/>
+      <w:lvlJc w:val="left"/>
+      <w:pPr>
+        <w:tabs>
+          <w:tab w:val="num" w:pos="720"/>
+        </w:tabs>
+        <w:ind w:left="720" w:hanging="360"/>
+      </w:pPr>
+      <w:rPr>
+        <w:rFonts w:ascii="Symbol" w:hAnsi="Symbol" w:hint="default"/>
+        <w:sz w:val="20"/>
+      </w:rPr>
+    </w:lvl>
+    <w:lvl w:ilvl="1" w:tentative="1">
+      <w:start w:val="1"/>
+      <w:numFmt w:val="bullet"/>
+      <w:lvlText w:val="o"/>
+      <w:lvlJc w:val="left"/>
+      <w:pPr>
+        <w:tabs>
+          <w:tab w:val="num" w:pos="1440"/>
+        </w:tabs>
+        <w:ind w:left="1440" w:hanging="360"/>
+      </w:pPr>
+      <w:rPr>
+        <w:rFonts w:ascii="Courier New" w:hAnsi="Courier New" w:hint="default"/>
+        <w:sz w:val="20"/>
+      </w:rPr>
+    </w:lvl>
+    <w:lvl w:ilvl="2" w:tentative="1">
+      <w:start w:val="1"/>
+      <w:numFmt w:val="bullet"/>
+      <w:lvlText w:val=""/>
+      <w:lvlJc w:val="left"/>
+      <w:pPr>
+        <w:tabs>
+          <w:tab w:val="num" w:pos="2160"/>
+        </w:tabs>
+        <w:ind w:left="2160" w:hanging="360"/>
+      </w:pPr>
+      <w:rPr>
+        <w:rFonts w:ascii="Wingdings" w:hAnsi="Wingdings" w:hint="default"/>
+        <w:sz w:val="20"/>
+      </w:rPr>
+    </w:lvl>
+    <w:lvl w:ilvl="3" w:tentative="1">
+      <w:start w:val="1"/>
+      <w:numFmt w:val="bullet"/>
+      <w:lvlText w:val=""/>
+      <w:lvlJc w:val="left"/>
+      <w:pPr>
+        <w:tabs>
+          <w:tab w:val="num" w:pos="2880"/>
+        </w:tabs>
+        <w:ind w:left="2880" w:hanging="360"/>
+      </w:pPr>
+      <w:rPr>
+        <w:rFonts w:ascii="Wingdings" w:hAnsi="Wingdings" w:hint="default"/>
+        <w:sz w:val="20"/>
+      </w:rPr>
+    </w:lvl>
+    <w:lvl w:ilvl="4" w:tentative="1">
+      <w:start w:val="1"/>
+      <w:numFmt w:val="bullet"/>
+      <w:lvlText w:val=""/>
+      <w:lvlJc w:val="left"/>
+      <w:pPr>
+        <w:tabs>
+          <w:tab w:val="num" w:pos="3600"/>
+        </w:tabs>
+        <w:ind w:left="3600" w:hanging="360"/>
+      </w:pPr>
+      <w:rPr>
+        <w:rFonts w:ascii="Wingdings" w:hAnsi="Wingdings" w:hint="default"/>
+        <w:sz w:val="20"/>
+      </w:rPr>
+    </w:lvl>
+    <w:lvl w:ilvl="5" w:tentative="1">
+      <w:start w:val="1"/>
+      <w:numFmt w:val="bullet"/>
+      <w:lvlText w:val=""/>
+      <w:lvlJc w:val="left"/>
+      <w:pPr>
+        <w:tabs>
+          <w:tab w:val="num" w:pos="4320"/>
+        </w:tabs>
+        <w:ind w:left="4320" w:hanging="360"/>
+      </w:pPr>
+      <w:rPr>
+        <w:rFonts w:ascii="Wingdings" w:hAnsi="Wingdings" w:hint="default"/>
+        <w:sz w:val="20"/>
+      </w:rPr>
+    </w:lvl>
+    <w:lvl w:ilvl="6" w:tentative="1">
+      <w:start w:val="1"/>
+      <w:numFmt w:val="bullet"/>
+      <w:lvlText w:val=""/>
+      <w:lvlJc w:val="left"/>
+      <w:pPr>
+        <w:tabs>
+          <w:tab w:val="num" w:pos="5040"/>
+        </w:tabs>
+        <w:ind w:left="5040" w:hanging="360"/>
+      </w:pPr>
+      <w:rPr>
+        <w:rFonts w:ascii="Wingdings" w:hAnsi="Wingdings" w:hint="default"/>
+        <w:sz w:val="20"/>
+      </w:rPr>
+    </w:lvl>
+    <w:lvl w:ilvl="7" w:tentative="1">
+      <w:start w:val="1"/>
+      <w:numFmt w:val="bullet"/>
+      <w:lvlText w:val=""/>
+      <w:lvlJc w:val="left"/>
+      <w:pPr>
+        <w:tabs>
+          <w:tab w:val="num" w:pos="5760"/>
+        </w:tabs>
+        <w:ind w:left="5760" w:hanging="360"/>
+      </w:pPr>
+      <w:rPr>
+        <w:rFonts w:ascii="Wingdings" w:hAnsi="Wingdings" w:hint="default"/>
+        <w:sz w:val="20"/>
+      </w:rPr>
+    </w:lvl>
+    <w:lvl w:ilvl="8" w:tentative="1">
+      <w:start w:val="1"/>
+      <w:numFmt w:val="bullet"/>
+      <w:lvlText w:val=""/>
+      <w:lvlJc w:val="left"/>
+      <w:pPr>
+        <w:tabs>
+          <w:tab w:val="num" w:pos="6480"/>
+        </w:tabs>
+        <w:ind w:left="6480" w:hanging="360"/>
+      </w:pPr>
+      <w:rPr>
+        <w:rFonts w:ascii="Wingdings" w:hAnsi="Wingdings" w:hint="default"/>
+        <w:sz w:val="20"/>
+      </w:rPr>
+    </w:lvl>
+  </w:abstractNum>
+  <w:abstractNum w:abstractNumId="56" w15:restartNumberingAfterBreak="0">
     <w:nsid w:val="6D1D4AD1"/>
     <w:multiLevelType w:val="multilevel"/>
     <w:tmpl w:val="1256AFE4"/>
@@ -28599,7 +30859,7 @@
       </w:rPr>
     </w:lvl>
   </w:abstractNum>
-  <w:abstractNum w:abstractNumId="51" w15:restartNumberingAfterBreak="0">
+  <w:abstractNum w:abstractNumId="57" w15:restartNumberingAfterBreak="0">
     <w:nsid w:val="6DC57EE4"/>
     <w:multiLevelType w:val="multilevel"/>
     <w:tmpl w:val="91725494"/>
@@ -28748,7 +31008,156 @@
       </w:rPr>
     </w:lvl>
   </w:abstractNum>
-  <w:abstractNum w:abstractNumId="52" w15:restartNumberingAfterBreak="0">
+  <w:abstractNum w:abstractNumId="58" w15:restartNumberingAfterBreak="0">
+    <w:nsid w:val="71D600D5"/>
+    <w:multiLevelType w:val="multilevel"/>
+    <w:tmpl w:val="34B0AB36"/>
+    <w:lvl w:ilvl="0">
+      <w:start w:val="1"/>
+      <w:numFmt w:val="bullet"/>
+      <w:lvlText w:val=""/>
+      <w:lvlJc w:val="left"/>
+      <w:pPr>
+        <w:tabs>
+          <w:tab w:val="num" w:pos="720"/>
+        </w:tabs>
+        <w:ind w:left="720" w:hanging="360"/>
+      </w:pPr>
+      <w:rPr>
+        <w:rFonts w:ascii="Symbol" w:hAnsi="Symbol" w:hint="default"/>
+        <w:sz w:val="20"/>
+      </w:rPr>
+    </w:lvl>
+    <w:lvl w:ilvl="1" w:tentative="1">
+      <w:start w:val="1"/>
+      <w:numFmt w:val="bullet"/>
+      <w:lvlText w:val="o"/>
+      <w:lvlJc w:val="left"/>
+      <w:pPr>
+        <w:tabs>
+          <w:tab w:val="num" w:pos="1440"/>
+        </w:tabs>
+        <w:ind w:left="1440" w:hanging="360"/>
+      </w:pPr>
+      <w:rPr>
+        <w:rFonts w:ascii="Courier New" w:hAnsi="Courier New" w:hint="default"/>
+        <w:sz w:val="20"/>
+      </w:rPr>
+    </w:lvl>
+    <w:lvl w:ilvl="2" w:tentative="1">
+      <w:start w:val="1"/>
+      <w:numFmt w:val="bullet"/>
+      <w:lvlText w:val=""/>
+      <w:lvlJc w:val="left"/>
+      <w:pPr>
+        <w:tabs>
+          <w:tab w:val="num" w:pos="2160"/>
+        </w:tabs>
+        <w:ind w:left="2160" w:hanging="360"/>
+      </w:pPr>
+      <w:rPr>
+        <w:rFonts w:ascii="Wingdings" w:hAnsi="Wingdings" w:hint="default"/>
+        <w:sz w:val="20"/>
+      </w:rPr>
+    </w:lvl>
+    <w:lvl w:ilvl="3" w:tentative="1">
+      <w:start w:val="1"/>
+      <w:numFmt w:val="bullet"/>
+      <w:lvlText w:val=""/>
+      <w:lvlJc w:val="left"/>
+      <w:pPr>
+        <w:tabs>
+          <w:tab w:val="num" w:pos="2880"/>
+        </w:tabs>
+        <w:ind w:left="2880" w:hanging="360"/>
+      </w:pPr>
+      <w:rPr>
+        <w:rFonts w:ascii="Wingdings" w:hAnsi="Wingdings" w:hint="default"/>
+        <w:sz w:val="20"/>
+      </w:rPr>
+    </w:lvl>
+    <w:lvl w:ilvl="4" w:tentative="1">
+      <w:start w:val="1"/>
+      <w:numFmt w:val="bullet"/>
+      <w:lvlText w:val=""/>
+      <w:lvlJc w:val="left"/>
+      <w:pPr>
+        <w:tabs>
+          <w:tab w:val="num" w:pos="3600"/>
+        </w:tabs>
+        <w:ind w:left="3600" w:hanging="360"/>
+      </w:pPr>
+      <w:rPr>
+        <w:rFonts w:ascii="Wingdings" w:hAnsi="Wingdings" w:hint="default"/>
+        <w:sz w:val="20"/>
+      </w:rPr>
+    </w:lvl>
+    <w:lvl w:ilvl="5" w:tentative="1">
+      <w:start w:val="1"/>
+      <w:numFmt w:val="bullet"/>
+      <w:lvlText w:val=""/>
+      <w:lvlJc w:val="left"/>
+      <w:pPr>
+        <w:tabs>
+          <w:tab w:val="num" w:pos="4320"/>
+        </w:tabs>
+        <w:ind w:left="4320" w:hanging="360"/>
+      </w:pPr>
+      <w:rPr>
+        <w:rFonts w:ascii="Wingdings" w:hAnsi="Wingdings" w:hint="default"/>
+        <w:sz w:val="20"/>
+      </w:rPr>
+    </w:lvl>
+    <w:lvl w:ilvl="6" w:tentative="1">
+      <w:start w:val="1"/>
+      <w:numFmt w:val="bullet"/>
+      <w:lvlText w:val=""/>
+      <w:lvlJc w:val="left"/>
+      <w:pPr>
+        <w:tabs>
+          <w:tab w:val="num" w:pos="5040"/>
+        </w:tabs>
+        <w:ind w:left="5040" w:hanging="360"/>
+      </w:pPr>
+      <w:rPr>
+        <w:rFonts w:ascii="Wingdings" w:hAnsi="Wingdings" w:hint="default"/>
+        <w:sz w:val="20"/>
+      </w:rPr>
+    </w:lvl>
+    <w:lvl w:ilvl="7" w:tentative="1">
+      <w:start w:val="1"/>
+      <w:numFmt w:val="bullet"/>
+      <w:lvlText w:val=""/>
+      <w:lvlJc w:val="left"/>
+      <w:pPr>
+        <w:tabs>
+          <w:tab w:val="num" w:pos="5760"/>
+        </w:tabs>
+        <w:ind w:left="5760" w:hanging="360"/>
+      </w:pPr>
+      <w:rPr>
+        <w:rFonts w:ascii="Wingdings" w:hAnsi="Wingdings" w:hint="default"/>
+        <w:sz w:val="20"/>
+      </w:rPr>
+    </w:lvl>
+    <w:lvl w:ilvl="8" w:tentative="1">
+      <w:start w:val="1"/>
+      <w:numFmt w:val="bullet"/>
+      <w:lvlText w:val=""/>
+      <w:lvlJc w:val="left"/>
+      <w:pPr>
+        <w:tabs>
+          <w:tab w:val="num" w:pos="6480"/>
+        </w:tabs>
+        <w:ind w:left="6480" w:hanging="360"/>
+      </w:pPr>
+      <w:rPr>
+        <w:rFonts w:ascii="Wingdings" w:hAnsi="Wingdings" w:hint="default"/>
+        <w:sz w:val="20"/>
+      </w:rPr>
+    </w:lvl>
+  </w:abstractNum>
+  <w:abstractNum w:abstractNumId="59" w15:restartNumberingAfterBreak="0">
     <w:nsid w:val="73D87508"/>
     <w:multiLevelType w:val="multilevel"/>
     <w:tmpl w:val="2714AAF8"/>
@@ -28861,7 +31270,7 @@
       </w:pPr>
     </w:lvl>
   </w:abstractNum>
-  <w:abstractNum w:abstractNumId="53" w15:restartNumberingAfterBreak="0">
+  <w:abstractNum w:abstractNumId="60" w15:restartNumberingAfterBreak="0">
     <w:nsid w:val="75842206"/>
     <w:multiLevelType w:val="multilevel"/>
     <w:tmpl w:val="0DB4FD6C"/>
@@ -29010,7 +31419,7 @@
       </w:rPr>
     </w:lvl>
   </w:abstractNum>
-  <w:abstractNum w:abstractNumId="54" w15:restartNumberingAfterBreak="0">
+  <w:abstractNum w:abstractNumId="61" w15:restartNumberingAfterBreak="0">
     <w:nsid w:val="78331662"/>
     <w:multiLevelType w:val="multilevel"/>
     <w:tmpl w:val="9FBEC74C"/>
@@ -29159,7 +31568,7 @@
       </w:rPr>
     </w:lvl>
   </w:abstractNum>
-  <w:abstractNum w:abstractNumId="55" w15:restartNumberingAfterBreak="0">
+  <w:abstractNum w:abstractNumId="62" w15:restartNumberingAfterBreak="0">
     <w:nsid w:val="79201A99"/>
     <w:multiLevelType w:val="multilevel"/>
     <w:tmpl w:val="130C0520"/>
@@ -29276,7 +31685,7 @@
       </w:pPr>
     </w:lvl>
   </w:abstractNum>
-  <w:abstractNum w:abstractNumId="56" w15:restartNumberingAfterBreak="0">
+  <w:abstractNum w:abstractNumId="63" w15:restartNumberingAfterBreak="0">
     <w:nsid w:val="7B4D09A9"/>
     <w:multiLevelType w:val="multilevel"/>
     <w:tmpl w:val="964C5D22"/>
@@ -29425,7 +31834,7 @@
       </w:rPr>
     </w:lvl>
   </w:abstractNum>
-  <w:abstractNum w:abstractNumId="57" w15:restartNumberingAfterBreak="0">
+  <w:abstractNum w:abstractNumId="64" w15:restartNumberingAfterBreak="0">
     <w:nsid w:val="7B6F151A"/>
     <w:multiLevelType w:val="multilevel"/>
     <w:tmpl w:val="713C81C6"/>
@@ -29538,7 +31947,7 @@
       </w:pPr>
     </w:lvl>
   </w:abstractNum>
-  <w:abstractNum w:abstractNumId="58" w15:restartNumberingAfterBreak="0">
+  <w:abstractNum w:abstractNumId="65" w15:restartNumberingAfterBreak="0">
     <w:nsid w:val="7CAD3C9E"/>
     <w:multiLevelType w:val="multilevel"/>
     <w:tmpl w:val="6032D502"/>
@@ -29651,7 +32060,7 @@
       </w:pPr>
     </w:lvl>
   </w:abstractNum>
-  <w:abstractNum w:abstractNumId="59" w15:restartNumberingAfterBreak="0">
+  <w:abstractNum w:abstractNumId="66" w15:restartNumberingAfterBreak="0">
     <w:nsid w:val="7E1E20E6"/>
     <w:multiLevelType w:val="multilevel"/>
     <w:tmpl w:val="881E662A"/>
@@ -29800,7 +32209,7 @@
       </w:rPr>
     </w:lvl>
   </w:abstractNum>
-  <w:abstractNum w:abstractNumId="60" w15:restartNumberingAfterBreak="0">
+  <w:abstractNum w:abstractNumId="67" w15:restartNumberingAfterBreak="0">
     <w:nsid w:val="7E9311E1"/>
     <w:multiLevelType w:val="multilevel"/>
     <w:tmpl w:val="1C2E968C"/>
@@ -29918,187 +32327,208 @@
     </w:lvl>
   </w:abstractNum>
   <w:num w:numId="1" w16cid:durableId="835341261">
-    <w:abstractNumId w:val="36"/>
+    <w:abstractNumId w:val="40"/>
   </w:num>
   <w:num w:numId="2" w16cid:durableId="245962368">
-    <w:abstractNumId w:val="25"/>
+    <w:abstractNumId w:val="28"/>
   </w:num>
   <w:num w:numId="3" w16cid:durableId="978802921">
-    <w:abstractNumId w:val="50"/>
+    <w:abstractNumId w:val="56"/>
   </w:num>
   <w:num w:numId="4" w16cid:durableId="2090495906">
-    <w:abstractNumId w:val="16"/>
+    <w:abstractNumId w:val="19"/>
   </w:num>
   <w:num w:numId="5" w16cid:durableId="1017347943">
-    <w:abstractNumId w:val="52"/>
+    <w:abstractNumId w:val="59"/>
   </w:num>
   <w:num w:numId="6" w16cid:durableId="983435607">
-    <w:abstractNumId w:val="45"/>
+    <w:abstractNumId w:val="50"/>
   </w:num>
   <w:num w:numId="7" w16cid:durableId="1264874487">
     <w:abstractNumId w:val="2"/>
   </w:num>
   <w:num w:numId="8" w16cid:durableId="19742500">
-    <w:abstractNumId w:val="13"/>
+    <w:abstractNumId w:val="14"/>
   </w:num>
   <w:num w:numId="9" w16cid:durableId="773331375">
+    <w:abstractNumId w:val="61"/>
+  </w:num>
+  <w:num w:numId="10" w16cid:durableId="432164859">
+    <w:abstractNumId w:val="10"/>
+  </w:num>
+  <w:num w:numId="11" w16cid:durableId="325011109">
+    <w:abstractNumId w:val="18"/>
+  </w:num>
+  <w:num w:numId="12" w16cid:durableId="364257319">
+    <w:abstractNumId w:val="52"/>
+  </w:num>
+  <w:num w:numId="13" w16cid:durableId="606544606">
+    <w:abstractNumId w:val="25"/>
+  </w:num>
+  <w:num w:numId="14" w16cid:durableId="575211147">
+    <w:abstractNumId w:val="51"/>
+  </w:num>
+  <w:num w:numId="15" w16cid:durableId="1757168469">
+    <w:abstractNumId w:val="36"/>
+  </w:num>
+  <w:num w:numId="16" w16cid:durableId="767820240">
+    <w:abstractNumId w:val="45"/>
+  </w:num>
+  <w:num w:numId="17" w16cid:durableId="1561094981">
+    <w:abstractNumId w:val="37"/>
+  </w:num>
+  <w:num w:numId="18" w16cid:durableId="100535705">
+    <w:abstractNumId w:val="62"/>
+  </w:num>
+  <w:num w:numId="19" w16cid:durableId="179665044">
     <w:abstractNumId w:val="54"/>
   </w:num>
-  <w:num w:numId="10" w16cid:durableId="432164859">
-    <w:abstractNumId w:val="9"/>
-  </w:num>
-  <w:num w:numId="11" w16cid:durableId="325011109">
-    <w:abstractNumId w:val="15"/>
-  </w:num>
-  <w:num w:numId="12" w16cid:durableId="364257319">
-    <w:abstractNumId w:val="47"/>
-  </w:num>
-  <w:num w:numId="13" w16cid:durableId="606544606">
-    <w:abstractNumId w:val="22"/>
-  </w:num>
-  <w:num w:numId="14" w16cid:durableId="575211147">
-    <w:abstractNumId w:val="46"/>
-  </w:num>
-  <w:num w:numId="15" w16cid:durableId="1757168469">
-    <w:abstractNumId w:val="32"/>
-  </w:num>
-  <w:num w:numId="16" w16cid:durableId="767820240">
-    <w:abstractNumId w:val="41"/>
-  </w:num>
-  <w:num w:numId="17" w16cid:durableId="1561094981">
-    <w:abstractNumId w:val="33"/>
-  </w:num>
-  <w:num w:numId="18" w16cid:durableId="100535705">
-    <w:abstractNumId w:val="55"/>
-  </w:num>
-  <w:num w:numId="19" w16cid:durableId="179665044">
-    <w:abstractNumId w:val="49"/>
-  </w:num>
   <w:num w:numId="20" w16cid:durableId="610740960">
-    <w:abstractNumId w:val="14"/>
+    <w:abstractNumId w:val="17"/>
   </w:num>
   <w:num w:numId="21" w16cid:durableId="1405444814">
     <w:abstractNumId w:val="3"/>
   </w:num>
   <w:num w:numId="22" w16cid:durableId="253511025">
-    <w:abstractNumId w:val="39"/>
+    <w:abstractNumId w:val="43"/>
   </w:num>
   <w:num w:numId="23" w16cid:durableId="86729159">
-    <w:abstractNumId w:val="26"/>
+    <w:abstractNumId w:val="29"/>
   </w:num>
   <w:num w:numId="24" w16cid:durableId="1912765321">
-    <w:abstractNumId w:val="38"/>
+    <w:abstractNumId w:val="42"/>
   </w:num>
   <w:num w:numId="25" w16cid:durableId="1962876223">
     <w:abstractNumId w:val="0"/>
   </w:num>
   <w:num w:numId="26" w16cid:durableId="280772383">
-    <w:abstractNumId w:val="31"/>
+    <w:abstractNumId w:val="34"/>
   </w:num>
   <w:num w:numId="27" w16cid:durableId="1834641134">
-    <w:abstractNumId w:val="30"/>
+    <w:abstractNumId w:val="33"/>
   </w:num>
   <w:num w:numId="28" w16cid:durableId="539246421">
     <w:abstractNumId w:val="4"/>
   </w:num>
   <w:num w:numId="29" w16cid:durableId="662246316">
-    <w:abstractNumId w:val="42"/>
+    <w:abstractNumId w:val="46"/>
   </w:num>
   <w:num w:numId="30" w16cid:durableId="269239490">
-    <w:abstractNumId w:val="40"/>
+    <w:abstractNumId w:val="44"/>
   </w:num>
   <w:num w:numId="31" w16cid:durableId="1918320490">
-    <w:abstractNumId w:val="60"/>
+    <w:abstractNumId w:val="67"/>
   </w:num>
   <w:num w:numId="32" w16cid:durableId="1664771748">
     <w:abstractNumId w:val="1"/>
   </w:num>
   <w:num w:numId="33" w16cid:durableId="90248865">
-    <w:abstractNumId w:val="57"/>
+    <w:abstractNumId w:val="64"/>
   </w:num>
   <w:num w:numId="34" w16cid:durableId="540436984">
-    <w:abstractNumId w:val="43"/>
+    <w:abstractNumId w:val="47"/>
   </w:num>
   <w:num w:numId="35" w16cid:durableId="642152380">
+    <w:abstractNumId w:val="13"/>
+  </w:num>
+  <w:num w:numId="36" w16cid:durableId="218981769">
+    <w:abstractNumId w:val="39"/>
+  </w:num>
+  <w:num w:numId="37" w16cid:durableId="607734053">
+    <w:abstractNumId w:val="65"/>
+  </w:num>
+  <w:num w:numId="38" w16cid:durableId="1374111736">
+    <w:abstractNumId w:val="49"/>
+  </w:num>
+  <w:num w:numId="39" w16cid:durableId="1288387291">
+    <w:abstractNumId w:val="26"/>
+  </w:num>
+  <w:num w:numId="40" w16cid:durableId="1002245025">
     <w:abstractNumId w:val="12"/>
   </w:num>
-  <w:num w:numId="36" w16cid:durableId="218981769">
-    <w:abstractNumId w:val="35"/>
-  </w:num>
-  <w:num w:numId="37" w16cid:durableId="607734053">
-    <w:abstractNumId w:val="58"/>
-  </w:num>
-  <w:num w:numId="38" w16cid:durableId="1374111736">
-    <w:abstractNumId w:val="44"/>
-  </w:num>
-  <w:num w:numId="39" w16cid:durableId="1288387291">
-    <w:abstractNumId w:val="23"/>
-  </w:num>
-  <w:num w:numId="40" w16cid:durableId="1002245025">
-    <w:abstractNumId w:val="11"/>
-  </w:num>
   <w:num w:numId="41" w16cid:durableId="1958758202">
-    <w:abstractNumId w:val="29"/>
+    <w:abstractNumId w:val="32"/>
   </w:num>
   <w:num w:numId="42" w16cid:durableId="1815101632">
-    <w:abstractNumId w:val="27"/>
+    <w:abstractNumId w:val="30"/>
   </w:num>
   <w:num w:numId="43" w16cid:durableId="930508649">
-    <w:abstractNumId w:val="34"/>
+    <w:abstractNumId w:val="38"/>
   </w:num>
   <w:num w:numId="44" w16cid:durableId="982928306">
-    <w:abstractNumId w:val="48"/>
+    <w:abstractNumId w:val="53"/>
   </w:num>
   <w:num w:numId="45" w16cid:durableId="406540881">
     <w:abstractNumId w:val="6"/>
   </w:num>
   <w:num w:numId="46" w16cid:durableId="572158302">
-    <w:abstractNumId w:val="19"/>
+    <w:abstractNumId w:val="22"/>
   </w:num>
   <w:num w:numId="47" w16cid:durableId="17196656">
-    <w:abstractNumId w:val="24"/>
+    <w:abstractNumId w:val="27"/>
   </w:num>
   <w:num w:numId="48" w16cid:durableId="1228345761">
-    <w:abstractNumId w:val="10"/>
+    <w:abstractNumId w:val="11"/>
   </w:num>
   <w:num w:numId="49" w16cid:durableId="1840537919">
     <w:abstractNumId w:val="8"/>
   </w:num>
   <w:num w:numId="50" w16cid:durableId="80177669">
-    <w:abstractNumId w:val="51"/>
+    <w:abstractNumId w:val="57"/>
   </w:num>
   <w:num w:numId="51" w16cid:durableId="2134211336">
-    <w:abstractNumId w:val="28"/>
+    <w:abstractNumId w:val="31"/>
   </w:num>
   <w:num w:numId="52" w16cid:durableId="273096438">
+    <w:abstractNumId w:val="24"/>
+  </w:num>
+  <w:num w:numId="53" w16cid:durableId="1752579186">
+    <w:abstractNumId w:val="60"/>
+  </w:num>
+  <w:num w:numId="54" w16cid:durableId="1435977814">
+    <w:abstractNumId w:val="23"/>
+  </w:num>
+  <w:num w:numId="55" w16cid:durableId="656036099">
     <w:abstractNumId w:val="21"/>
   </w:num>
-  <w:num w:numId="53" w16cid:durableId="1752579186">
-    <w:abstractNumId w:val="53"/>
-  </w:num>
-  <w:num w:numId="54" w16cid:durableId="1435977814">
-    <w:abstractNumId w:val="20"/>
-  </w:num>
-  <w:num w:numId="55" w16cid:durableId="656036099">
-    <w:abstractNumId w:val="18"/>
-  </w:num>
   <w:num w:numId="56" w16cid:durableId="293752074">
-    <w:abstractNumId w:val="37"/>
+    <w:abstractNumId w:val="41"/>
   </w:num>
   <w:num w:numId="57" w16cid:durableId="976380656">
-    <w:abstractNumId w:val="56"/>
+    <w:abstractNumId w:val="63"/>
   </w:num>
   <w:num w:numId="58" w16cid:durableId="781608170">
-    <w:abstractNumId w:val="17"/>
+    <w:abstractNumId w:val="20"/>
   </w:num>
   <w:num w:numId="59" w16cid:durableId="1989238643">
     <w:abstractNumId w:val="5"/>
   </w:num>
   <w:num w:numId="60" w16cid:durableId="1826702147">
-    <w:abstractNumId w:val="59"/>
+    <w:abstractNumId w:val="66"/>
   </w:num>
   <w:num w:numId="61" w16cid:durableId="190610050">
     <w:abstractNumId w:val="7"/>
+  </w:num>
+  <w:num w:numId="62" w16cid:durableId="631864739">
+    <w:abstractNumId w:val="16"/>
+  </w:num>
+  <w:num w:numId="63" w16cid:durableId="2081172476">
+    <w:abstractNumId w:val="9"/>
+  </w:num>
+  <w:num w:numId="64" w16cid:durableId="870269551">
+    <w:abstractNumId w:val="15"/>
+  </w:num>
+  <w:num w:numId="65" w16cid:durableId="1988781468">
+    <w:abstractNumId w:val="55"/>
+  </w:num>
+  <w:num w:numId="66" w16cid:durableId="1186679060">
+    <w:abstractNumId w:val="48"/>
+  </w:num>
+  <w:num w:numId="67" w16cid:durableId="802112135">
+    <w:abstractNumId w:val="35"/>
+  </w:num>
+  <w:num w:numId="68" w16cid:durableId="1801652449">
+    <w:abstractNumId w:val="58"/>
   </w:num>
 </w:numbering>
 </file>
@@ -31019,6 +33449,23 @@
       <w:spacing w:val="5"/>
     </w:rPr>
   </w:style>
+  <w:style w:type="paragraph" w:styleId="NormalWeb">
+    <w:name w:val="Normal (Web)"/>
+    <w:basedOn w:val="Normal"/>
+    <w:uiPriority w:val="99"/>
+    <w:semiHidden/>
+    <w:unhideWhenUsed/>
+    <w:rsid w:val="00E81C17"/>
+    <w:pPr>
+      <w:spacing w:before="100" w:beforeAutospacing="1" w:after="100" w:afterAutospacing="1" w:line="240" w:lineRule="auto"/>
+    </w:pPr>
+    <w:rPr>
+      <w:rFonts w:ascii="Times New Roman" w:eastAsia="Times New Roman" w:hAnsi="Times New Roman" w:cs="Times New Roman"/>
+      <w:kern w:val="0"/>
+      <w:lang w:bidi="hi-IN"/>
+      <w14:ligatures w14:val="none"/>
+    </w:rPr>
+  </w:style>
 </w:styles>
 </file>
 

</xml_diff>